<commit_message>
fix(docx): two-column layout with dark sidebar matching HTML design
</commit_message>
<xml_diff>
--- a/Mohamad_Firdaus_Resume_2026.docx
+++ b/Mohamad_Firdaus_Resume_2026.docx
@@ -2,744 +2,1404 @@
 <file path=word/document.xml><?xml version="1.0" encoding="utf-8"?>
 <w:document xmlns:wpc="http://schemas.microsoft.com/office/word/2010/wordprocessingCanvas" xmlns:mo="http://schemas.microsoft.com/office/mac/office/2008/main" xmlns:mc="http://schemas.openxmlformats.org/markup-compatibility/2006" xmlns:mv="urn:schemas-microsoft-com:mac:vml" xmlns:o="urn:schemas-microsoft-com:office:office" xmlns:r="http://schemas.openxmlformats.org/officeDocument/2006/relationships" xmlns:m="http://schemas.openxmlformats.org/officeDocument/2006/math" xmlns:v="urn:schemas-microsoft-com:vml" xmlns:wp14="http://schemas.microsoft.com/office/word/2010/wordprocessingDrawing" xmlns:wp="http://schemas.openxmlformats.org/drawingml/2006/wordprocessingDrawing" xmlns:w10="urn:schemas-microsoft-com:office:word" xmlns:w="http://schemas.openxmlformats.org/wordprocessingml/2006/main" xmlns:w14="http://schemas.microsoft.com/office/word/2010/wordml" xmlns:wpg="http://schemas.microsoft.com/office/word/2010/wordprocessingGroup" xmlns:wpi="http://schemas.microsoft.com/office/word/2010/wordprocessingInk" xmlns:wne="http://schemas.microsoft.com/office/word/2006/wordml" xmlns:wps="http://schemas.microsoft.com/office/word/2010/wordprocessingShape" mc:Ignorable="w14 wp14">
   <w:body>
-    <w:p>
-      <w:pPr>
-        <w:spacing w:after="0"/>
-      </w:pPr>
-      <w:r>
-        <w:rPr>
-          <w:rFonts w:ascii="Calibri" w:hAnsi="Calibri"/>
-          <w:b/>
-          <w:color w:val="1A1A2E"/>
-          <w:sz w:val="44"/>
-        </w:rPr>
-        <w:t>MOHAMAD FIRDAUS</w:t>
-      </w:r>
-    </w:p>
-    <w:p>
-      <w:pPr>
-        <w:spacing w:before="0" w:after="0"/>
-      </w:pPr>
-      <w:r>
-        <w:rPr>
-          <w:rFonts w:ascii="Calibri" w:hAnsi="Calibri"/>
-          <w:b/>
-          <w:color w:val="22C55E"/>
-          <w:sz w:val="20"/>
-        </w:rPr>
-        <w:t>Built an ERP that replaced SAP, from scratch.</w:t>
-      </w:r>
-    </w:p>
-    <w:p>
-      <w:pPr>
-        <w:spacing w:before="0" w:after="80"/>
-      </w:pPr>
-      <w:r>
-        <w:rPr>
-          <w:rFonts w:ascii="Calibri" w:hAnsi="Calibri"/>
-          <w:color w:val="777777"/>
-          <w:sz w:val="17"/>
-        </w:rPr>
-        <w:t>Senior Software Engineer  |  15+ Years  |  Full-Stack  |  AI/ML  |  Balik Pulau, Penang</w:t>
-      </w:r>
-    </w:p>
-    <w:p>
-      <w:pPr>
-        <w:spacing w:before="0" w:after="120"/>
-      </w:pPr>
-      <w:r>
-        <w:rPr>
-          <w:rFonts w:ascii="Calibri" w:hAnsi="Calibri"/>
-          <w:color w:val="888888"/>
-          <w:sz w:val="16"/>
-        </w:rPr>
-        <w:t>014-3043514  |  fdfrontdev@gmail.com  |  linkedin.com/in/fdfrontdev</w:t>
-      </w:r>
-    </w:p>
-    <w:p>
-      <w:pPr>
-        <w:spacing w:before="0" w:after="120"/>
-        <w:pBdr>
-          <w:bottom w:val="single" w:sz="8" w:space="1" w:color="22C55E"/>
-        </w:pBdr>
-      </w:pPr>
-    </w:p>
-    <w:p>
-      <w:pPr>
-        <w:spacing w:before="200" w:after="80"/>
-        <w:pBdr>
-          <w:bottom w:val="single" w:sz="4" w:space="1" w:color="22C55E"/>
-        </w:pBdr>
-      </w:pPr>
-      <w:r>
-        <w:rPr>
-          <w:rFonts w:ascii="Calibri" w:hAnsi="Calibri"/>
-          <w:b/>
-          <w:color w:val="22C55E"/>
-          <w:sz w:val="20"/>
-        </w:rPr>
-        <w:t>WHO I AM</w:t>
-      </w:r>
-    </w:p>
-    <w:p>
-      <w:pPr>
-        <w:spacing w:before="0" w:after="120" w:line="280" w:lineRule="exact"/>
-      </w:pPr>
-      <w:r>
-        <w:rPr>
-          <w:rFonts w:ascii="Calibri" w:hAnsi="Calibri"/>
-          <w:color w:val="166534"/>
-          <w:sz w:val="19"/>
-        </w:rPr>
-        <w:t>Self-taught engineer who built a complete ERP replacing SAP/Navision. 15+ years across finance, retail, education, recruitment tech, and palm oil. I build systems that solve real business problems — not prototypes, not toys.</w:t>
-      </w:r>
-    </w:p>
-    <w:p>
-      <w:pPr>
-        <w:spacing w:before="200" w:after="80"/>
-        <w:pBdr>
-          <w:bottom w:val="single" w:sz="4" w:space="1" w:color="22C55E"/>
-        </w:pBdr>
-      </w:pPr>
-      <w:r>
-        <w:rPr>
-          <w:rFonts w:ascii="Calibri" w:hAnsi="Calibri"/>
-          <w:b/>
-          <w:color w:val="22C55E"/>
-          <w:sz w:val="20"/>
-        </w:rPr>
-        <w:t>EXPERIENCE</w:t>
-      </w:r>
-    </w:p>
-    <w:p>
-      <w:pPr>
-        <w:spacing w:before="100" w:after="0" w:line="280" w:lineRule="exact"/>
-      </w:pPr>
-      <w:r>
-        <w:rPr>
-          <w:rFonts w:ascii="Calibri" w:hAnsi="Calibri"/>
-          <w:b/>
-          <w:color w:val="1A1A2E"/>
-          <w:sz w:val="21"/>
-        </w:rPr>
-        <w:t>Senior Software Engineer / Head of Software</w:t>
-      </w:r>
-    </w:p>
-    <w:p>
-      <w:pPr>
-        <w:spacing w:before="0" w:after="40"/>
-      </w:pPr>
-      <w:r>
-        <w:rPr>
-          <w:rFonts w:ascii="Calibri" w:hAnsi="Calibri"/>
-          <w:i/>
-          <w:color w:val="555555"/>
-          <w:sz w:val="20"/>
-        </w:rPr>
-        <w:t>GlobalIoT Sdn Bhd  |  2024 – Present</w:t>
-      </w:r>
-    </w:p>
-    <w:p>
-      <w:pPr>
-        <w:pStyle w:val="ListBullet"/>
-        <w:spacing w:before="0" w:after="20" w:line="260" w:lineRule="exact"/>
-      </w:pPr>
-      <w:r>
-        <w:rPr>
-          <w:rFonts w:ascii="Calibri" w:hAnsi="Calibri"/>
-          <w:sz w:val="19"/>
-        </w:rPr>
-        <w:t>Architected and built EOIOT — a full ERP replacing SAP/Navision for palm oil refinery operations (supply chain, finance, HR, procurement, operations)</w:t>
-      </w:r>
-    </w:p>
-    <w:p>
-      <w:pPr>
-        <w:pStyle w:val="ListBullet"/>
-        <w:spacing w:before="0" w:after="20" w:line="260" w:lineRule="exact"/>
-      </w:pPr>
-      <w:r>
-        <w:rPr>
-          <w:rFonts w:ascii="Calibri" w:hAnsi="Calibri"/>
-          <w:sz w:val="19"/>
-        </w:rPr>
-        <w:t>Led a team of engineers, established code review, CI/CD, and development standards</w:t>
-      </w:r>
-    </w:p>
-    <w:p>
-      <w:pPr>
-        <w:pStyle w:val="ListBullet"/>
-        <w:spacing w:before="0" w:after="20" w:line="260" w:lineRule="exact"/>
-      </w:pPr>
-      <w:r>
-        <w:rPr>
-          <w:rFonts w:ascii="Calibri" w:hAnsi="Calibri"/>
-          <w:sz w:val="19"/>
-        </w:rPr>
-        <w:t>Wore 7 hats: BA, PM, Architect, Developer, QA, Support Lead, Mentor</w:t>
-      </w:r>
-    </w:p>
-    <w:p>
-      <w:pPr>
-        <w:pStyle w:val="ListBullet"/>
-        <w:spacing w:before="0" w:after="20" w:line="260" w:lineRule="exact"/>
-      </w:pPr>
-      <w:r>
-        <w:rPr>
-          <w:rFonts w:ascii="Calibri" w:hAnsi="Calibri"/>
-          <w:sz w:val="19"/>
-        </w:rPr>
-        <w:t>Served a government-linked client (Sawit Kinabalu / Kunak Refinery)</w:t>
-      </w:r>
-    </w:p>
-    <w:p>
-      <w:pPr>
-        <w:spacing w:before="100" w:after="0" w:line="280" w:lineRule="exact"/>
-      </w:pPr>
-      <w:r>
-        <w:rPr>
-          <w:rFonts w:ascii="Calibri" w:hAnsi="Calibri"/>
-          <w:b/>
-          <w:color w:val="1A1A2E"/>
-          <w:sz w:val="21"/>
-        </w:rPr>
-        <w:t>Web Developer</w:t>
-      </w:r>
-    </w:p>
-    <w:p>
-      <w:pPr>
-        <w:spacing w:before="0" w:after="40"/>
-      </w:pPr>
-      <w:r>
-        <w:rPr>
-          <w:rFonts w:ascii="Calibri" w:hAnsi="Calibri"/>
-          <w:i/>
-          <w:color w:val="555555"/>
-          <w:sz w:val="20"/>
-        </w:rPr>
-        <w:t>ePandu Sdn Bhd  |  2022 – 2024</w:t>
-      </w:r>
-    </w:p>
-    <w:p>
-      <w:pPr>
-        <w:pStyle w:val="ListBullet"/>
-        <w:spacing w:before="0" w:after="20" w:line="260" w:lineRule="exact"/>
-      </w:pPr>
-      <w:r>
-        <w:rPr>
-          <w:rFonts w:ascii="Calibri" w:hAnsi="Calibri"/>
-          <w:sz w:val="19"/>
-        </w:rPr>
-        <w:t>Built job portal platform with merchant subscriptions generating recurring revenue</w:t>
-      </w:r>
-    </w:p>
-    <w:p>
-      <w:pPr>
-        <w:pStyle w:val="ListBullet"/>
-        <w:spacing w:before="0" w:after="20" w:line="260" w:lineRule="exact"/>
-      </w:pPr>
-      <w:r>
-        <w:rPr>
-          <w:rFonts w:ascii="Calibri" w:hAnsi="Calibri"/>
-          <w:sz w:val="19"/>
-        </w:rPr>
-        <w:t>Built full e-commerce platform — product management, payments, fulfillment</w:t>
-      </w:r>
-    </w:p>
-    <w:p>
-      <w:pPr>
-        <w:spacing w:before="100" w:after="0" w:line="280" w:lineRule="exact"/>
-      </w:pPr>
-      <w:r>
-        <w:rPr>
-          <w:rFonts w:ascii="Calibri" w:hAnsi="Calibri"/>
-          <w:b/>
-          <w:color w:val="1A1A2E"/>
-          <w:sz w:val="21"/>
-        </w:rPr>
-        <w:t>E-Commerce Developer</w:t>
-      </w:r>
-    </w:p>
-    <w:p>
-      <w:pPr>
-        <w:spacing w:before="0" w:after="40"/>
-      </w:pPr>
-      <w:r>
-        <w:rPr>
-          <w:rFonts w:ascii="Calibri" w:hAnsi="Calibri"/>
-          <w:i/>
-          <w:color w:val="555555"/>
-          <w:sz w:val="20"/>
-        </w:rPr>
-        <w:t>GAMA Supermarket &amp; Department Store  |  2021</w:t>
-      </w:r>
-    </w:p>
-    <w:p>
-      <w:pPr>
-        <w:pStyle w:val="ListBullet"/>
-        <w:spacing w:before="0" w:after="20" w:line="260" w:lineRule="exact"/>
-      </w:pPr>
-      <w:r>
-        <w:rPr>
-          <w:rFonts w:ascii="Calibri" w:hAnsi="Calibri"/>
-          <w:sz w:val="19"/>
-        </w:rPr>
-        <w:t>Built e-commerce platform from scratch for a major retail chain</w:t>
-      </w:r>
-    </w:p>
-    <w:p>
-      <w:pPr>
-        <w:pStyle w:val="ListBullet"/>
-        <w:spacing w:before="0" w:after="20" w:line="260" w:lineRule="exact"/>
-      </w:pPr>
-      <w:r>
-        <w:rPr>
-          <w:rFonts w:ascii="Calibri" w:hAnsi="Calibri"/>
-          <w:sz w:val="19"/>
-        </w:rPr>
-        <w:t>Managed the e-commerce department and cross-functional coordination</w:t>
-      </w:r>
-    </w:p>
-    <w:p>
-      <w:pPr>
-        <w:spacing w:before="100" w:after="0" w:line="280" w:lineRule="exact"/>
-      </w:pPr>
-      <w:r>
-        <w:rPr>
-          <w:rFonts w:ascii="Calibri" w:hAnsi="Calibri"/>
-          <w:b/>
-          <w:color w:val="1A1A2E"/>
-          <w:sz w:val="21"/>
-        </w:rPr>
-        <w:t>IT Support Specialist</w:t>
-      </w:r>
-    </w:p>
-    <w:p>
-      <w:pPr>
-        <w:spacing w:before="0" w:after="40"/>
-      </w:pPr>
-      <w:r>
-        <w:rPr>
-          <w:rFonts w:ascii="Calibri" w:hAnsi="Calibri"/>
-          <w:i/>
-          <w:color w:val="555555"/>
-          <w:sz w:val="20"/>
-        </w:rPr>
-        <w:t>DISTED College  |  2019 – 2020</w:t>
-      </w:r>
-    </w:p>
-    <w:p>
-      <w:pPr>
-        <w:pStyle w:val="ListBullet"/>
-        <w:spacing w:before="0" w:after="20" w:line="260" w:lineRule="exact"/>
-      </w:pPr>
-      <w:r>
-        <w:rPr>
-          <w:rFonts w:ascii="Calibri" w:hAnsi="Calibri"/>
-          <w:sz w:val="19"/>
-        </w:rPr>
-        <w:t>Built library management, ticketing, and knowledge base systems in-house</w:t>
-      </w:r>
-    </w:p>
-    <w:p>
-      <w:pPr>
-        <w:pStyle w:val="ListBullet"/>
-        <w:spacing w:before="0" w:after="20" w:line="260" w:lineRule="exact"/>
-      </w:pPr>
-      <w:r>
-        <w:rPr>
-          <w:rFonts w:ascii="Calibri" w:hAnsi="Calibri"/>
-          <w:sz w:val="19"/>
-        </w:rPr>
-        <w:t>Automated audit processes with custom scripts. Maintained ISO 9001 compliance.</w:t>
-      </w:r>
-    </w:p>
-    <w:p>
-      <w:pPr>
-        <w:spacing w:before="100" w:after="0" w:line="280" w:lineRule="exact"/>
-      </w:pPr>
-      <w:r>
-        <w:rPr>
-          <w:rFonts w:ascii="Calibri" w:hAnsi="Calibri"/>
-          <w:b/>
-          <w:color w:val="1A1A2E"/>
-          <w:sz w:val="21"/>
-        </w:rPr>
-        <w:t>Assistant IT Supervisor</w:t>
-      </w:r>
-    </w:p>
-    <w:p>
-      <w:pPr>
-        <w:spacing w:before="0" w:after="40"/>
-      </w:pPr>
-      <w:r>
-        <w:rPr>
-          <w:rFonts w:ascii="Calibri" w:hAnsi="Calibri"/>
-          <w:i/>
-          <w:color w:val="555555"/>
-          <w:sz w:val="20"/>
-        </w:rPr>
-        <w:t>GAMA Supermarket &amp; Department Store  |  2016 – 2018</w:t>
-      </w:r>
-    </w:p>
-    <w:p>
-      <w:pPr>
-        <w:pStyle w:val="ListBullet"/>
-        <w:spacing w:before="0" w:after="20" w:line="260" w:lineRule="exact"/>
-      </w:pPr>
-      <w:r>
-        <w:rPr>
-          <w:rFonts w:ascii="Calibri" w:hAnsi="Calibri"/>
-          <w:sz w:val="19"/>
-        </w:rPr>
-        <w:t>Led company-wide POS system deployment. Built ticketing and knowledge base systems.</w:t>
-      </w:r>
-    </w:p>
-    <w:p>
-      <w:pPr>
-        <w:spacing w:before="100" w:after="0" w:line="280" w:lineRule="exact"/>
-      </w:pPr>
-      <w:r>
-        <w:rPr>
-          <w:rFonts w:ascii="Calibri" w:hAnsi="Calibri"/>
-          <w:b/>
-          <w:color w:val="1A1A2E"/>
-          <w:sz w:val="21"/>
-        </w:rPr>
-        <w:t>Software Engineer</w:t>
-      </w:r>
-    </w:p>
-    <w:p>
-      <w:pPr>
-        <w:spacing w:before="0" w:after="40"/>
-      </w:pPr>
-      <w:r>
-        <w:rPr>
-          <w:rFonts w:ascii="Calibri" w:hAnsi="Calibri"/>
-          <w:i/>
-          <w:color w:val="555555"/>
-          <w:sz w:val="20"/>
-        </w:rPr>
-        <w:t>UniKL Resources Sdn Bhd  |  2012 – 2015</w:t>
-      </w:r>
-    </w:p>
-    <w:p>
-      <w:pPr>
-        <w:pStyle w:val="ListBullet"/>
-        <w:spacing w:before="0" w:after="20" w:line="260" w:lineRule="exact"/>
-      </w:pPr>
-      <w:r>
-        <w:rPr>
-          <w:rFonts w:ascii="Calibri" w:hAnsi="Calibri"/>
-          <w:sz w:val="19"/>
-        </w:rPr>
-        <w:t>Built financial system for MARA (government agency)</w:t>
-      </w:r>
-    </w:p>
-    <w:p>
-      <w:pPr>
-        <w:pStyle w:val="ListBullet"/>
-        <w:spacing w:before="0" w:after="20" w:line="260" w:lineRule="exact"/>
-      </w:pPr>
-      <w:r>
-        <w:rPr>
-          <w:rFonts w:ascii="Calibri" w:hAnsi="Calibri"/>
-          <w:sz w:val="19"/>
-        </w:rPr>
-        <w:t>Web services for e-Perolehan integration. Extended MS Dynamics AX.</w:t>
-      </w:r>
-    </w:p>
-    <w:p>
-      <w:pPr>
-        <w:spacing w:before="200" w:after="80"/>
-        <w:pBdr>
-          <w:bottom w:val="single" w:sz="4" w:space="1" w:color="22C55E"/>
-        </w:pBdr>
-      </w:pPr>
-      <w:r>
-        <w:rPr>
-          <w:rFonts w:ascii="Calibri" w:hAnsi="Calibri"/>
-          <w:b/>
-          <w:color w:val="22C55E"/>
-          <w:sz w:val="20"/>
-        </w:rPr>
-        <w:t>FEATURED PROJECTS</w:t>
-      </w:r>
-    </w:p>
-    <w:p>
-      <w:pPr>
-        <w:spacing w:before="60" w:after="0" w:line="260" w:lineRule="exact"/>
-      </w:pPr>
-      <w:r>
-        <w:rPr>
-          <w:rFonts w:ascii="Calibri" w:hAnsi="Calibri"/>
-          <w:b/>
-          <w:color w:val="1A1A2E"/>
-          <w:sz w:val="19"/>
-        </w:rPr>
-        <w:t>EOIOT — Enterprise ERP for Palm Oil</w:t>
-      </w:r>
-    </w:p>
-    <w:p>
-      <w:pPr>
-        <w:spacing w:before="0" w:after="0" w:line="260" w:lineRule="exact"/>
-      </w:pPr>
-      <w:r>
-        <w:rPr>
-          <w:rFonts w:ascii="Calibri" w:hAnsi="Calibri"/>
-          <w:color w:val="555555"/>
-          <w:sz w:val="18"/>
-        </w:rPr>
-        <w:t>Full-scale ERP replacing SAP/Navision. Supply chain, finance, HR, procurement, refinery operations.</w:t>
-      </w:r>
-    </w:p>
-    <w:p>
-      <w:pPr>
-        <w:spacing w:before="0" w:after="40" w:line="240" w:lineRule="exact"/>
-      </w:pPr>
-      <w:r>
-        <w:rPr>
-          <w:rFonts w:ascii="Calibri" w:hAnsi="Calibri"/>
-          <w:i/>
-          <w:color w:val="999999"/>
-          <w:sz w:val="16"/>
-        </w:rPr>
-        <w:t>Stack: Nuxt · Vue · Python · Prisma · PostgreSQL</w:t>
-      </w:r>
-    </w:p>
-    <w:p>
-      <w:pPr>
-        <w:spacing w:before="60" w:after="0" w:line="260" w:lineRule="exact"/>
-      </w:pPr>
-      <w:r>
-        <w:rPr>
-          <w:rFonts w:ascii="Calibri" w:hAnsi="Calibri"/>
-          <w:b/>
-          <w:color w:val="1A1A2E"/>
-          <w:sz w:val="19"/>
-        </w:rPr>
-        <w:t>TradeAI — AI Forex Trading System</w:t>
-      </w:r>
-    </w:p>
-    <w:p>
-      <w:pPr>
-        <w:spacing w:before="0" w:after="0" w:line="260" w:lineRule="exact"/>
-      </w:pPr>
-      <w:r>
-        <w:rPr>
-          <w:rFonts w:ascii="Calibri" w:hAnsi="Calibri"/>
-          <w:color w:val="555555"/>
-          <w:sz w:val="18"/>
-        </w:rPr>
-        <w:t>ML-powered forex prediction generating calibrated BUY/SELL probabilities from historical data.</w:t>
-      </w:r>
-    </w:p>
-    <w:p>
-      <w:pPr>
-        <w:spacing w:before="0" w:after="40" w:line="240" w:lineRule="exact"/>
-      </w:pPr>
-      <w:r>
-        <w:rPr>
-          <w:rFonts w:ascii="Calibri" w:hAnsi="Calibri"/>
-          <w:i/>
-          <w:color w:val="999999"/>
-          <w:sz w:val="16"/>
-        </w:rPr>
-        <w:t>Stack: Python · FastAPI · Scikit-Learn · Pandas</w:t>
-      </w:r>
-    </w:p>
-    <w:p>
-      <w:pPr>
-        <w:spacing w:before="60" w:after="0" w:line="260" w:lineRule="exact"/>
-      </w:pPr>
-      <w:r>
-        <w:rPr>
-          <w:rFonts w:ascii="Calibri" w:hAnsi="Calibri"/>
-          <w:b/>
-          <w:color w:val="1A1A2E"/>
-          <w:sz w:val="19"/>
-        </w:rPr>
-        <w:t>EMS — Engineering Management SaaS</w:t>
-      </w:r>
-    </w:p>
-    <w:p>
-      <w:pPr>
-        <w:spacing w:before="0" w:after="0" w:line="260" w:lineRule="exact"/>
-      </w:pPr>
-      <w:r>
-        <w:rPr>
-          <w:rFonts w:ascii="Calibri" w:hAnsi="Calibri"/>
-          <w:color w:val="555555"/>
-          <w:sz w:val="18"/>
-        </w:rPr>
-        <w:t>Platform for managing teams, projects, and delivery with proper engineering standards.</w:t>
-      </w:r>
-    </w:p>
-    <w:p>
-      <w:pPr>
-        <w:spacing w:before="0" w:after="40" w:line="240" w:lineRule="exact"/>
-      </w:pPr>
-      <w:r>
-        <w:rPr>
-          <w:rFonts w:ascii="Calibri" w:hAnsi="Calibri"/>
-          <w:i/>
-          <w:color w:val="999999"/>
-          <w:sz w:val="16"/>
-        </w:rPr>
-        <w:t>Stack: Nuxt · Vue · Vuetify · Prisma · TypeScript</w:t>
-      </w:r>
-    </w:p>
-    <w:p>
-      <w:pPr>
-        <w:spacing w:before="60" w:after="0" w:line="260" w:lineRule="exact"/>
-      </w:pPr>
-      <w:r>
-        <w:rPr>
-          <w:rFonts w:ascii="Calibri" w:hAnsi="Calibri"/>
-          <w:b/>
-          <w:color w:val="1A1A2E"/>
-          <w:sz w:val="19"/>
-        </w:rPr>
-        <w:t>Second Brain — AI Knowledge System</w:t>
-      </w:r>
-    </w:p>
-    <w:p>
-      <w:pPr>
-        <w:spacing w:before="0" w:after="0" w:line="260" w:lineRule="exact"/>
-      </w:pPr>
-      <w:r>
-        <w:rPr>
-          <w:rFonts w:ascii="Calibri" w:hAnsi="Calibri"/>
-          <w:color w:val="555555"/>
-          <w:sz w:val="18"/>
-        </w:rPr>
-        <w:t>AI system processing 125,000+ documents with semantic search, knowledge graphs, and automated ingestion.</w:t>
-      </w:r>
-    </w:p>
-    <w:p>
-      <w:pPr>
-        <w:spacing w:before="0" w:after="40" w:line="240" w:lineRule="exact"/>
-      </w:pPr>
-      <w:r>
-        <w:rPr>
-          <w:rFonts w:ascii="Calibri" w:hAnsi="Calibri"/>
-          <w:i/>
-          <w:color w:val="999999"/>
-          <w:sz w:val="16"/>
-        </w:rPr>
-        <w:t>Stack: Python · ChromaDB · LLM · FastAPI · SQLite</w:t>
-      </w:r>
-    </w:p>
-    <w:p>
-      <w:pPr>
-        <w:spacing w:before="200" w:after="80"/>
-        <w:pBdr>
-          <w:bottom w:val="single" w:sz="4" w:space="1" w:color="22C55E"/>
-        </w:pBdr>
-      </w:pPr>
-      <w:r>
-        <w:rPr>
-          <w:rFonts w:ascii="Calibri" w:hAnsi="Calibri"/>
-          <w:b/>
-          <w:color w:val="22C55E"/>
-          <w:sz w:val="20"/>
-        </w:rPr>
-        <w:t>EDUCATION</w:t>
-      </w:r>
-    </w:p>
-    <w:p>
-      <w:pPr>
-        <w:spacing w:before="60" w:after="80" w:line="280" w:lineRule="exact"/>
-      </w:pPr>
-      <w:r>
-        <w:rPr>
-          <w:rFonts w:ascii="Calibri" w:hAnsi="Calibri"/>
-          <w:b/>
-          <w:sz w:val="19"/>
-        </w:rPr>
-        <w:t>University Kuala Lumpur (UniKL MIIT) — B.Comp (Hons) Entrepreneurial Management, CGPA 3.30</w:t>
-      </w:r>
-    </w:p>
-    <w:p>
-      <w:pPr>
-        <w:pStyle w:val="ListBullet"/>
-        <w:spacing w:before="0" w:after="20" w:line="260" w:lineRule="exact"/>
-      </w:pPr>
-      <w:r>
-        <w:rPr>
-          <w:rFonts w:ascii="Calibri" w:hAnsi="Calibri"/>
-          <w:sz w:val="19"/>
-        </w:rPr>
-        <w:t>Dean's List Award (2 semesters)</w:t>
-      </w:r>
-    </w:p>
-    <w:p>
-      <w:pPr>
-        <w:pStyle w:val="ListBullet"/>
-        <w:spacing w:before="0" w:after="20" w:line="260" w:lineRule="exact"/>
-      </w:pPr>
-      <w:r>
-        <w:rPr>
-          <w:rFonts w:ascii="Calibri" w:hAnsi="Calibri"/>
-          <w:sz w:val="19"/>
-        </w:rPr>
-        <w:t>Exchange Student at Yonsei University, Seoul, South Korea</w:t>
-      </w:r>
-    </w:p>
-    <w:p>
-      <w:pPr>
-        <w:pStyle w:val="ListBullet"/>
-        <w:spacing w:before="0" w:after="20" w:line="260" w:lineRule="exact"/>
-      </w:pPr>
-      <w:r>
-        <w:rPr>
-          <w:rFonts w:ascii="Calibri" w:hAnsi="Calibri"/>
-          <w:sz w:val="19"/>
-        </w:rPr>
-        <w:t>Best Final Year Project 2012 — Expert Advisor for Financial Markets</w:t>
-      </w:r>
-    </w:p>
-    <w:p>
-      <w:pPr>
-        <w:spacing w:before="200" w:after="80"/>
-        <w:pBdr>
-          <w:bottom w:val="single" w:sz="4" w:space="1" w:color="22C55E"/>
-        </w:pBdr>
-      </w:pPr>
-      <w:r>
-        <w:rPr>
-          <w:rFonts w:ascii="Calibri" w:hAnsi="Calibri"/>
-          <w:b/>
-          <w:color w:val="22C55E"/>
-          <w:sz w:val="20"/>
-        </w:rPr>
-        <w:t>WHY HIRE ME</w:t>
-      </w:r>
-    </w:p>
-    <w:p>
-      <w:pPr>
-        <w:spacing w:before="40" w:after="0" w:line="280" w:lineRule="exact"/>
-      </w:pPr>
-      <w:r>
-        <w:rPr>
-          <w:rFonts w:ascii="Calibri" w:hAnsi="Calibri"/>
-          <w:color w:val="166534"/>
-          <w:sz w:val="19"/>
-        </w:rPr>
-        <w:t xml:space="preserve">I replaced SAP with a custom ERP. I built 4 production systems from zero. 15 years of self-taught engineering across 6 industries. I lead teams, architect solutions, and ship code that works. </w:t>
-      </w:r>
-      <w:r>
-        <w:rPr>
-          <w:rFonts w:ascii="Calibri" w:hAnsi="Calibri"/>
-          <w:b/>
-          <w:color w:val="166534"/>
-          <w:sz w:val="19"/>
-        </w:rPr>
-        <w:t>Most engineers write code. I build businesses.</w:t>
-      </w:r>
-    </w:p>
+    <w:tbl>
+      <w:tblGrid>
+        <w:gridCol w:w="3800"/>
+        <w:gridCol w:w="13200"/>
+      </w:tblGrid>
+      <w:tblPr>
+        <w:tblW w:type="auto" w:w="0"/>
+        <w:jc w:val="center"/>
+        <w:tblLayout w:type="autofit"/>
+        <w:tblLook w:firstColumn="1" w:firstRow="1" w:lastColumn="0" w:lastRow="0" w:noHBand="0" w:noVBand="1" w:val="04A0"/>
+        <w:tblW w:w="17000" w:type="dxa"/>
+      </w:tblPr>
+      <w:tblGrid>
+        <w:gridCol w:w="4680"/>
+        <w:gridCol w:w="4680"/>
+      </w:tblGrid>
+      <w:tr>
+        <w:tc>
+          <w:tcPr>
+            <w:tcW w:type="dxa" w:w="4680"/>
+            <w:shd w:fill="1a1a2e" w:val="clear"/>
+          </w:tcPr>
+          <w:p>
+            <w:pPr>
+              <w:spacing w:before="0" w:after="0"/>
+            </w:pPr>
+          </w:p>
+          <w:p>
+            <w:pPr>
+              <w:spacing w:before="0" w:after="0" w:line="240" w:lineRule="exact"/>
+            </w:pPr>
+            <w:r>
+              <w:rPr>
+                <w:rFonts w:ascii="Calibri" w:hAnsi="Calibri"/>
+                <w:b w:val="0"/>
+                <w:color w:val="BBBBBB"/>
+                <w:sz w:val="12"/>
+              </w:rPr>
+            </w:r>
+          </w:p>
+          <w:p>
+            <w:pPr>
+              <w:spacing w:before="240" w:after="60" w:line="260" w:lineRule="exact"/>
+              <w:pBdr>
+                <w:bottom w:val="single" w:sz="4" w:space="1" w:color="22C55E"/>
+              </w:pBdr>
+            </w:pPr>
+            <w:r>
+              <w:rPr>
+                <w:rFonts w:ascii="Calibri" w:hAnsi="Calibri"/>
+                <w:b/>
+                <w:color w:val="22C55E"/>
+                <w:sz w:val="15"/>
+              </w:rPr>
+              <w:t>CONTACT</w:t>
+            </w:r>
+          </w:p>
+          <w:p>
+            <w:pPr>
+              <w:spacing w:before="0" w:after="0" w:line="220" w:lineRule="exact"/>
+            </w:pPr>
+            <w:r>
+              <w:rPr>
+                <w:rFonts w:ascii="Calibri" w:hAnsi="Calibri"/>
+                <w:b w:val="0"/>
+                <w:color w:val="BBBBBB"/>
+                <w:sz w:val="14"/>
+              </w:rPr>
+              <w:t>014-3043514</w:t>
+            </w:r>
+          </w:p>
+          <w:p>
+            <w:pPr>
+              <w:spacing w:before="0" w:after="0" w:line="220" w:lineRule="exact"/>
+            </w:pPr>
+            <w:r>
+              <w:rPr>
+                <w:rFonts w:ascii="Calibri" w:hAnsi="Calibri"/>
+                <w:b w:val="0"/>
+                <w:color w:val="BBBBBB"/>
+                <w:sz w:val="14"/>
+              </w:rPr>
+              <w:t>fdfrontdev@gmail.com</w:t>
+            </w:r>
+          </w:p>
+          <w:p>
+            <w:pPr>
+              <w:spacing w:before="0" w:after="0" w:line="220" w:lineRule="exact"/>
+            </w:pPr>
+            <w:r>
+              <w:rPr>
+                <w:rFonts w:ascii="Calibri" w:hAnsi="Calibri"/>
+                <w:b w:val="0"/>
+                <w:color w:val="BBBBBB"/>
+                <w:sz w:val="14"/>
+              </w:rPr>
+              <w:t>Balik Pulau, Penang</w:t>
+            </w:r>
+          </w:p>
+          <w:p>
+            <w:pPr>
+              <w:spacing w:before="0" w:after="0" w:line="220" w:lineRule="exact"/>
+            </w:pPr>
+            <w:r>
+              <w:rPr>
+                <w:rFonts w:ascii="Calibri" w:hAnsi="Calibri"/>
+                <w:b w:val="0"/>
+                <w:color w:val="BBBBBB"/>
+                <w:sz w:val="14"/>
+              </w:rPr>
+              <w:t>linkedin.com/in/fdfrontdev</w:t>
+            </w:r>
+          </w:p>
+          <w:p>
+            <w:pPr>
+              <w:spacing w:before="0" w:after="0" w:line="220" w:lineRule="exact"/>
+            </w:pPr>
+            <w:r>
+              <w:rPr>
+                <w:rFonts w:ascii="Calibri" w:hAnsi="Calibri"/>
+                <w:b w:val="0"/>
+                <w:color w:val="BBBBBB"/>
+                <w:sz w:val="14"/>
+              </w:rPr>
+              <w:t>github.com/fdfrontdev</w:t>
+            </w:r>
+          </w:p>
+          <w:p>
+            <w:pPr>
+              <w:spacing w:before="0" w:after="0" w:line="220" w:lineRule="exact"/>
+            </w:pPr>
+            <w:r>
+              <w:rPr>
+                <w:rFonts w:ascii="Calibri" w:hAnsi="Calibri"/>
+                <w:b w:val="0"/>
+                <w:color w:val="BBBBBB"/>
+                <w:sz w:val="14"/>
+              </w:rPr>
+              <w:t>fdfrontdev.github.io</w:t>
+            </w:r>
+          </w:p>
+          <w:p>
+            <w:pPr>
+              <w:spacing w:before="240" w:after="60" w:line="260" w:lineRule="exact"/>
+              <w:pBdr>
+                <w:bottom w:val="single" w:sz="4" w:space="1" w:color="22C55E"/>
+              </w:pBdr>
+            </w:pPr>
+            <w:r>
+              <w:rPr>
+                <w:rFonts w:ascii="Calibri" w:hAnsi="Calibri"/>
+                <w:b/>
+                <w:color w:val="22C55E"/>
+                <w:sz w:val="15"/>
+              </w:rPr>
+              <w:t>SKILLS</w:t>
+            </w:r>
+          </w:p>
+          <w:p>
+            <w:pPr>
+              <w:spacing w:before="0" w:after="0" w:line="220" w:lineRule="exact"/>
+            </w:pPr>
+            <w:r>
+              <w:rPr>
+                <w:rFonts w:ascii="Calibri" w:hAnsi="Calibri"/>
+                <w:b w:val="0"/>
+                <w:color w:val="4ADE80"/>
+                <w:sz w:val="13"/>
+              </w:rPr>
+              <w:t>ERP Architecture</w:t>
+            </w:r>
+          </w:p>
+          <w:p>
+            <w:pPr>
+              <w:spacing w:before="0" w:after="0" w:line="220" w:lineRule="exact"/>
+            </w:pPr>
+            <w:r>
+              <w:rPr>
+                <w:rFonts w:ascii="Calibri" w:hAnsi="Calibri"/>
+                <w:b w:val="0"/>
+                <w:color w:val="4ADE80"/>
+                <w:sz w:val="13"/>
+              </w:rPr>
+              <w:t>Full-Stack Dev</w:t>
+            </w:r>
+          </w:p>
+          <w:p>
+            <w:pPr>
+              <w:spacing w:before="0" w:after="0" w:line="220" w:lineRule="exact"/>
+            </w:pPr>
+            <w:r>
+              <w:rPr>
+                <w:rFonts w:ascii="Calibri" w:hAnsi="Calibri"/>
+                <w:b w:val="0"/>
+                <w:color w:val="4ADE80"/>
+                <w:sz w:val="13"/>
+              </w:rPr>
+              <w:t>AI/ML Integration</w:t>
+            </w:r>
+          </w:p>
+          <w:p>
+            <w:pPr>
+              <w:spacing w:before="0" w:after="0" w:line="220" w:lineRule="exact"/>
+            </w:pPr>
+            <w:r>
+              <w:rPr>
+                <w:rFonts w:ascii="Calibri" w:hAnsi="Calibri"/>
+                <w:b w:val="0"/>
+                <w:color w:val="4ADE80"/>
+                <w:sz w:val="13"/>
+              </w:rPr>
+              <w:t>System Design</w:t>
+            </w:r>
+          </w:p>
+          <w:p>
+            <w:pPr>
+              <w:spacing w:before="0" w:after="0" w:line="220" w:lineRule="exact"/>
+            </w:pPr>
+            <w:r>
+              <w:rPr>
+                <w:rFonts w:ascii="Calibri" w:hAnsi="Calibri"/>
+                <w:b w:val="0"/>
+                <w:color w:val="4ADE80"/>
+                <w:sz w:val="13"/>
+              </w:rPr>
+              <w:t>Team Leadership</w:t>
+            </w:r>
+          </w:p>
+          <w:p>
+            <w:pPr>
+              <w:spacing w:before="0" w:after="0" w:line="220" w:lineRule="exact"/>
+            </w:pPr>
+            <w:r>
+              <w:rPr>
+                <w:rFonts w:ascii="Calibri" w:hAnsi="Calibri"/>
+                <w:b w:val="0"/>
+                <w:color w:val="4ADE80"/>
+                <w:sz w:val="13"/>
+              </w:rPr>
+              <w:t>Python</w:t>
+            </w:r>
+          </w:p>
+          <w:p>
+            <w:pPr>
+              <w:spacing w:before="0" w:after="0" w:line="220" w:lineRule="exact"/>
+            </w:pPr>
+            <w:r>
+              <w:rPr>
+                <w:rFonts w:ascii="Calibri" w:hAnsi="Calibri"/>
+                <w:b w:val="0"/>
+                <w:color w:val="4ADE80"/>
+                <w:sz w:val="13"/>
+              </w:rPr>
+              <w:t>TypeScript</w:t>
+            </w:r>
+          </w:p>
+          <w:p>
+            <w:pPr>
+              <w:spacing w:before="0" w:after="0" w:line="220" w:lineRule="exact"/>
+            </w:pPr>
+            <w:r>
+              <w:rPr>
+                <w:rFonts w:ascii="Calibri" w:hAnsi="Calibri"/>
+                <w:b w:val="0"/>
+                <w:color w:val="4ADE80"/>
+                <w:sz w:val="13"/>
+              </w:rPr>
+              <w:t>Nuxt / Vue</w:t>
+            </w:r>
+          </w:p>
+          <w:p>
+            <w:pPr>
+              <w:spacing w:before="0" w:after="0" w:line="220" w:lineRule="exact"/>
+            </w:pPr>
+            <w:r>
+              <w:rPr>
+                <w:rFonts w:ascii="Calibri" w:hAnsi="Calibri"/>
+                <w:b w:val="0"/>
+                <w:color w:val="4ADE80"/>
+                <w:sz w:val="13"/>
+              </w:rPr>
+              <w:t>Vuetify</w:t>
+            </w:r>
+          </w:p>
+          <w:p>
+            <w:pPr>
+              <w:spacing w:before="0" w:after="0" w:line="220" w:lineRule="exact"/>
+            </w:pPr>
+            <w:r>
+              <w:rPr>
+                <w:rFonts w:ascii="Calibri" w:hAnsi="Calibri"/>
+                <w:b w:val="0"/>
+                <w:color w:val="4ADE80"/>
+                <w:sz w:val="13"/>
+              </w:rPr>
+              <w:t>Prisma</w:t>
+            </w:r>
+          </w:p>
+          <w:p>
+            <w:pPr>
+              <w:spacing w:before="0" w:after="0" w:line="220" w:lineRule="exact"/>
+            </w:pPr>
+            <w:r>
+              <w:rPr>
+                <w:rFonts w:ascii="Calibri" w:hAnsi="Calibri"/>
+                <w:b w:val="0"/>
+                <w:color w:val="4ADE80"/>
+                <w:sz w:val="13"/>
+              </w:rPr>
+              <w:t>PostgreSQL</w:t>
+            </w:r>
+          </w:p>
+          <w:p>
+            <w:pPr>
+              <w:spacing w:before="0" w:after="0" w:line="220" w:lineRule="exact"/>
+            </w:pPr>
+            <w:r>
+              <w:rPr>
+                <w:rFonts w:ascii="Calibri" w:hAnsi="Calibri"/>
+                <w:b w:val="0"/>
+                <w:color w:val="4ADE80"/>
+                <w:sz w:val="13"/>
+              </w:rPr>
+              <w:t>FastAPI</w:t>
+            </w:r>
+          </w:p>
+          <w:p>
+            <w:pPr>
+              <w:spacing w:before="0" w:after="0" w:line="220" w:lineRule="exact"/>
+            </w:pPr>
+            <w:r>
+              <w:rPr>
+                <w:rFonts w:ascii="Calibri" w:hAnsi="Calibri"/>
+                <w:b w:val="0"/>
+                <w:color w:val="4ADE80"/>
+                <w:sz w:val="13"/>
+              </w:rPr>
+              <w:t>Scikit-Learn</w:t>
+            </w:r>
+          </w:p>
+          <w:p>
+            <w:pPr>
+              <w:spacing w:before="0" w:after="0" w:line="220" w:lineRule="exact"/>
+            </w:pPr>
+            <w:r>
+              <w:rPr>
+                <w:rFonts w:ascii="Calibri" w:hAnsi="Calibri"/>
+                <w:b w:val="0"/>
+                <w:color w:val="4ADE80"/>
+                <w:sz w:val="13"/>
+              </w:rPr>
+              <w:t>Git / CI/CD</w:t>
+            </w:r>
+          </w:p>
+          <w:p>
+            <w:pPr>
+              <w:spacing w:before="240" w:after="60" w:line="260" w:lineRule="exact"/>
+              <w:pBdr>
+                <w:bottom w:val="single" w:sz="4" w:space="1" w:color="22C55E"/>
+              </w:pBdr>
+            </w:pPr>
+            <w:r>
+              <w:rPr>
+                <w:rFonts w:ascii="Calibri" w:hAnsi="Calibri"/>
+                <w:b/>
+                <w:color w:val="22C55E"/>
+                <w:sz w:val="15"/>
+              </w:rPr>
+              <w:t>EDUCATION</w:t>
+            </w:r>
+          </w:p>
+          <w:p>
+            <w:pPr>
+              <w:spacing w:before="0" w:after="0" w:line="240" w:lineRule="exact"/>
+            </w:pPr>
+            <w:r>
+              <w:rPr>
+                <w:rFonts w:ascii="Calibri" w:hAnsi="Calibri"/>
+                <w:b/>
+                <w:color w:val="BBBBBB"/>
+                <w:sz w:val="15"/>
+              </w:rPr>
+              <w:t>UniKL MIIT</w:t>
+            </w:r>
+          </w:p>
+          <w:p>
+            <w:pPr>
+              <w:spacing w:before="0" w:after="0" w:line="230" w:lineRule="exact"/>
+            </w:pPr>
+            <w:r>
+              <w:rPr>
+                <w:rFonts w:ascii="Calibri" w:hAnsi="Calibri"/>
+                <w:color w:val="BBBBBB"/>
+                <w:sz w:val="13"/>
+              </w:rPr>
+              <w:t>- B.Comp (Hons) Entrepreneurial Mgmt</w:t>
+            </w:r>
+          </w:p>
+          <w:p>
+            <w:pPr>
+              <w:spacing w:before="0" w:after="0" w:line="230" w:lineRule="exact"/>
+            </w:pPr>
+            <w:r>
+              <w:rPr>
+                <w:rFonts w:ascii="Calibri" w:hAnsi="Calibri"/>
+                <w:color w:val="BBBBBB"/>
+                <w:sz w:val="13"/>
+              </w:rPr>
+              <w:t>- CGPA 3.30 | Deans List 2x</w:t>
+            </w:r>
+          </w:p>
+          <w:p>
+            <w:pPr>
+              <w:spacing w:before="0" w:after="0" w:line="230" w:lineRule="exact"/>
+            </w:pPr>
+            <w:r>
+              <w:rPr>
+                <w:rFonts w:ascii="Calibri" w:hAnsi="Calibri"/>
+                <w:color w:val="BBBBBB"/>
+                <w:sz w:val="13"/>
+              </w:rPr>
+              <w:t>- Exchange: Yonsei Univ. S.Korea</w:t>
+            </w:r>
+          </w:p>
+          <w:p>
+            <w:pPr>
+              <w:spacing w:before="0" w:after="0" w:line="230" w:lineRule="exact"/>
+            </w:pPr>
+            <w:r>
+              <w:rPr>
+                <w:rFonts w:ascii="Calibri" w:hAnsi="Calibri"/>
+                <w:color w:val="BBBBBB"/>
+                <w:sz w:val="13"/>
+              </w:rPr>
+              <w:t>- Best Final Year Project 2012</w:t>
+            </w:r>
+          </w:p>
+          <w:p>
+            <w:pPr>
+              <w:spacing w:before="240" w:after="60" w:line="260" w:lineRule="exact"/>
+              <w:pBdr>
+                <w:bottom w:val="single" w:sz="4" w:space="1" w:color="22C55E"/>
+              </w:pBdr>
+            </w:pPr>
+            <w:r>
+              <w:rPr>
+                <w:rFonts w:ascii="Calibri" w:hAnsi="Calibri"/>
+                <w:b/>
+                <w:color w:val="22C55E"/>
+                <w:sz w:val="15"/>
+              </w:rPr>
+              <w:t>HIGHLIGHTS</w:t>
+            </w:r>
+          </w:p>
+          <w:p>
+            <w:pPr>
+              <w:spacing w:before="0" w:after="0" w:line="230" w:lineRule="exact"/>
+            </w:pPr>
+            <w:r>
+              <w:rPr>
+                <w:rFonts w:ascii="Calibri" w:hAnsi="Calibri"/>
+                <w:color w:val="BBBBBB"/>
+                <w:sz w:val="13"/>
+              </w:rPr>
+              <w:t>- Built ERP replacing SAP</w:t>
+            </w:r>
+          </w:p>
+          <w:p>
+            <w:pPr>
+              <w:spacing w:before="0" w:after="0" w:line="230" w:lineRule="exact"/>
+            </w:pPr>
+            <w:r>
+              <w:rPr>
+                <w:rFonts w:ascii="Calibri" w:hAnsi="Calibri"/>
+                <w:color w:val="BBBBBB"/>
+                <w:sz w:val="13"/>
+              </w:rPr>
+              <w:t>- 4 production systems from scratch</w:t>
+            </w:r>
+          </w:p>
+          <w:p>
+            <w:pPr>
+              <w:spacing w:before="0" w:after="0" w:line="230" w:lineRule="exact"/>
+            </w:pPr>
+            <w:r>
+              <w:rPr>
+                <w:rFonts w:ascii="Calibri" w:hAnsi="Calibri"/>
+                <w:color w:val="BBBBBB"/>
+                <w:sz w:val="13"/>
+              </w:rPr>
+              <w:t>- Led team as pioneer employee</w:t>
+            </w:r>
+          </w:p>
+          <w:p>
+            <w:pPr>
+              <w:spacing w:before="0" w:after="0" w:line="230" w:lineRule="exact"/>
+            </w:pPr>
+            <w:r>
+              <w:rPr>
+                <w:rFonts w:ascii="Calibri" w:hAnsi="Calibri"/>
+                <w:color w:val="BBBBBB"/>
+                <w:sz w:val="13"/>
+              </w:rPr>
+              <w:t>- Best FYP award 2012</w:t>
+            </w:r>
+          </w:p>
+          <w:p>
+            <w:pPr>
+              <w:spacing w:before="240" w:after="60" w:line="260" w:lineRule="exact"/>
+              <w:pBdr>
+                <w:bottom w:val="single" w:sz="4" w:space="1" w:color="22C55E"/>
+              </w:pBdr>
+            </w:pPr>
+            <w:r>
+              <w:rPr>
+                <w:rFonts w:ascii="Calibri" w:hAnsi="Calibri"/>
+                <w:b/>
+                <w:color w:val="22C55E"/>
+                <w:sz w:val="15"/>
+              </w:rPr>
+              <w:t>LANGUAGES</w:t>
+            </w:r>
+          </w:p>
+          <w:p>
+            <w:pPr>
+              <w:spacing w:before="0" w:after="0" w:line="220" w:lineRule="exact"/>
+            </w:pPr>
+            <w:r>
+              <w:rPr>
+                <w:rFonts w:ascii="Calibri" w:hAnsi="Calibri"/>
+                <w:b w:val="0"/>
+                <w:color w:val="BBBBBB"/>
+                <w:sz w:val="13"/>
+              </w:rPr>
+              <w:t>Malay (Native)</w:t>
+            </w:r>
+          </w:p>
+          <w:p>
+            <w:pPr>
+              <w:spacing w:before="0" w:after="0" w:line="220" w:lineRule="exact"/>
+            </w:pPr>
+            <w:r>
+              <w:rPr>
+                <w:rFonts w:ascii="Calibri" w:hAnsi="Calibri"/>
+                <w:b w:val="0"/>
+                <w:color w:val="BBBBBB"/>
+                <w:sz w:val="13"/>
+              </w:rPr>
+              <w:t>English (Professional)</w:t>
+            </w:r>
+          </w:p>
+        </w:tc>
+        <w:tc>
+          <w:tcPr>
+            <w:tcW w:type="dxa" w:w="4680"/>
+            <w:shd w:fill="ffffff" w:val="clear"/>
+          </w:tcPr>
+          <w:p>
+            <w:pPr>
+              <w:spacing w:before="0" w:after="0"/>
+            </w:pPr>
+          </w:p>
+          <w:p>
+            <w:pPr>
+              <w:spacing w:before="0" w:after="0" w:line="240" w:lineRule="exact"/>
+            </w:pPr>
+            <w:r>
+              <w:rPr>
+                <w:rFonts w:ascii="Calibri" w:hAnsi="Calibri"/>
+                <w:b w:val="0"/>
+                <w:color w:val="BBBBBB"/>
+                <w:sz w:val="8"/>
+              </w:rPr>
+            </w:r>
+          </w:p>
+          <w:p>
+            <w:pPr>
+              <w:spacing w:before="0" w:after="0" w:line="400" w:lineRule="exact"/>
+            </w:pPr>
+            <w:r>
+              <w:rPr>
+                <w:rFonts w:ascii="Calibri" w:hAnsi="Calibri"/>
+                <w:b/>
+                <w:color w:val="111111"/>
+                <w:sz w:val="40"/>
+              </w:rPr>
+              <w:t>MOHAMAD FIRDAUS</w:t>
+            </w:r>
+          </w:p>
+          <w:p>
+            <w:pPr>
+              <w:spacing w:before="0" w:after="0"/>
+            </w:pPr>
+            <w:r>
+              <w:rPr>
+                <w:rFonts w:ascii="Calibri" w:hAnsi="Calibri"/>
+                <w:b/>
+                <w:color w:val="22C55E"/>
+                <w:sz w:val="19"/>
+              </w:rPr>
+              <w:t>Built an ERP that replaced SAP, from scratch.</w:t>
+            </w:r>
+          </w:p>
+          <w:p>
+            <w:pPr>
+              <w:spacing w:before="0" w:after="80"/>
+            </w:pPr>
+            <w:r>
+              <w:rPr>
+                <w:rFonts w:ascii="Calibri" w:hAnsi="Calibri"/>
+                <w:color w:val="888888"/>
+                <w:sz w:val="16"/>
+              </w:rPr>
+              <w:t>Senior Software Engineer  ·  15+ Years  ·  Full-Stack  ·  AI/ML  ·  Balik Pulau, Penang</w:t>
+            </w:r>
+          </w:p>
+          <w:p>
+            <w:pPr>
+              <w:spacing w:before="0" w:after="80"/>
+              <w:pBdr>
+                <w:bottom w:val="single" w:sz="8" w:space="1" w:color="22C55E"/>
+              </w:pBdr>
+            </w:pPr>
+          </w:p>
+          <w:p>
+            <w:pPr>
+              <w:spacing w:before="160" w:after="60" w:line="280" w:lineRule="exact"/>
+              <w:pBdr>
+                <w:bottom w:val="single" w:sz="4" w:space="1" w:color="22C55E"/>
+              </w:pBdr>
+            </w:pPr>
+            <w:r>
+              <w:rPr>
+                <w:rFonts w:ascii="Calibri" w:hAnsi="Calibri"/>
+                <w:b/>
+                <w:color w:val="22C55E"/>
+                <w:sz w:val="18"/>
+              </w:rPr>
+              <w:t>WHO I AM</w:t>
+            </w:r>
+          </w:p>
+          <w:p>
+            <w:pPr>
+              <w:spacing w:before="0" w:after="80" w:line="260" w:lineRule="exact"/>
+            </w:pPr>
+            <w:r>
+              <w:rPr>
+                <w:rFonts w:ascii="Calibri" w:hAnsi="Calibri"/>
+                <w:color w:val="166534"/>
+                <w:sz w:val="17"/>
+              </w:rPr>
+              <w:t>Self-taught engineer who built a complete ERP replacing SAP/Navision for the palm oil industry. 15+ years across finance, retail, education, recruitment tech, and palm oil. I build systems that solve real business problems — not prototypes, not toys.</w:t>
+            </w:r>
+          </w:p>
+          <w:p>
+            <w:pPr>
+              <w:spacing w:before="160" w:after="60" w:line="280" w:lineRule="exact"/>
+              <w:pBdr>
+                <w:bottom w:val="single" w:sz="4" w:space="1" w:color="22C55E"/>
+              </w:pBdr>
+            </w:pPr>
+            <w:r>
+              <w:rPr>
+                <w:rFonts w:ascii="Calibri" w:hAnsi="Calibri"/>
+                <w:b/>
+                <w:color w:val="22C55E"/>
+                <w:sz w:val="18"/>
+              </w:rPr>
+              <w:t>EXPERIENCE</w:t>
+            </w:r>
+          </w:p>
+          <w:p>
+            <w:pPr>
+              <w:spacing w:before="100" w:after="0" w:line="260" w:lineRule="exact"/>
+            </w:pPr>
+            <w:r>
+              <w:rPr>
+                <w:rFonts w:ascii="Calibri" w:hAnsi="Calibri"/>
+                <w:b/>
+                <w:color w:val="111111"/>
+                <w:sz w:val="19"/>
+              </w:rPr>
+              <w:t>Senior Software Engineer / Head of Software</w:t>
+            </w:r>
+            <w:r>
+              <w:rPr>
+                <w:rFonts w:ascii="Calibri" w:hAnsi="Calibri"/>
+                <w:color w:val="22C55E"/>
+                <w:sz w:val="16"/>
+              </w:rPr>
+              <w:t xml:space="preserve">    2024 – Present</w:t>
+            </w:r>
+          </w:p>
+          <w:p>
+            <w:pPr>
+              <w:spacing w:before="0" w:after="20" w:line="240" w:lineRule="exact"/>
+            </w:pPr>
+            <w:r>
+              <w:rPr>
+                <w:rFonts w:ascii="Calibri" w:hAnsi="Calibri"/>
+                <w:i/>
+                <w:color w:val="888888"/>
+                <w:sz w:val="17"/>
+              </w:rPr>
+              <w:t>GlobalIoT Sdn Bhd</w:t>
+            </w:r>
+          </w:p>
+          <w:p>
+            <w:pPr>
+              <w:spacing w:before="0" w:after="0" w:line="250" w:lineRule="exact"/>
+            </w:pPr>
+            <w:r>
+              <w:rPr>
+                <w:rFonts w:ascii="Calibri" w:hAnsi="Calibri"/>
+                <w:color w:val="22C55E"/>
+                <w:sz w:val="16"/>
+              </w:rPr>
+              <w:t xml:space="preserve">  •  </w:t>
+            </w:r>
+            <w:r>
+              <w:rPr>
+                <w:rFonts w:ascii="Calibri" w:hAnsi="Calibri"/>
+                <w:color w:val="333333"/>
+                <w:sz w:val="16"/>
+              </w:rPr>
+              <w:t>Architected and built EOIOT — a full ERP replacing SAP/Navision for palm oil refinery operations (supply chain, finance, HR, procurement, operations)</w:t>
+            </w:r>
+          </w:p>
+          <w:p>
+            <w:pPr>
+              <w:spacing w:before="0" w:after="0" w:line="250" w:lineRule="exact"/>
+            </w:pPr>
+            <w:r>
+              <w:rPr>
+                <w:rFonts w:ascii="Calibri" w:hAnsi="Calibri"/>
+                <w:color w:val="22C55E"/>
+                <w:sz w:val="16"/>
+              </w:rPr>
+              <w:t xml:space="preserve">  •  </w:t>
+            </w:r>
+            <w:r>
+              <w:rPr>
+                <w:rFonts w:ascii="Calibri" w:hAnsi="Calibri"/>
+                <w:color w:val="333333"/>
+                <w:sz w:val="16"/>
+              </w:rPr>
+              <w:t>Led a team of engineers, established code review, CI/CD, and development standards</w:t>
+            </w:r>
+          </w:p>
+          <w:p>
+            <w:pPr>
+              <w:spacing w:before="0" w:after="0" w:line="250" w:lineRule="exact"/>
+            </w:pPr>
+            <w:r>
+              <w:rPr>
+                <w:rFonts w:ascii="Calibri" w:hAnsi="Calibri"/>
+                <w:color w:val="22C55E"/>
+                <w:sz w:val="16"/>
+              </w:rPr>
+              <w:t xml:space="preserve">  •  </w:t>
+            </w:r>
+            <w:r>
+              <w:rPr>
+                <w:rFonts w:ascii="Calibri" w:hAnsi="Calibri"/>
+                <w:color w:val="333333"/>
+                <w:sz w:val="16"/>
+              </w:rPr>
+              <w:t>Wore 7 hats: BA, PM, Architect, Developer, QA, Support Lead, Mentor</w:t>
+            </w:r>
+          </w:p>
+          <w:p>
+            <w:pPr>
+              <w:spacing w:before="0" w:after="0" w:line="250" w:lineRule="exact"/>
+            </w:pPr>
+            <w:r>
+              <w:rPr>
+                <w:rFonts w:ascii="Calibri" w:hAnsi="Calibri"/>
+                <w:color w:val="22C55E"/>
+                <w:sz w:val="16"/>
+              </w:rPr>
+              <w:t xml:space="preserve">  •  </w:t>
+            </w:r>
+            <w:r>
+              <w:rPr>
+                <w:rFonts w:ascii="Calibri" w:hAnsi="Calibri"/>
+                <w:color w:val="333333"/>
+                <w:sz w:val="16"/>
+              </w:rPr>
+              <w:t>Served a government-linked client (Sawit Kinabalu / Kunak Refinery)</w:t>
+            </w:r>
+          </w:p>
+          <w:p>
+            <w:pPr>
+              <w:spacing w:before="100" w:after="0" w:line="260" w:lineRule="exact"/>
+            </w:pPr>
+            <w:r>
+              <w:rPr>
+                <w:rFonts w:ascii="Calibri" w:hAnsi="Calibri"/>
+                <w:b/>
+                <w:color w:val="111111"/>
+                <w:sz w:val="19"/>
+              </w:rPr>
+              <w:t>Web Developer</w:t>
+            </w:r>
+            <w:r>
+              <w:rPr>
+                <w:rFonts w:ascii="Calibri" w:hAnsi="Calibri"/>
+                <w:color w:val="22C55E"/>
+                <w:sz w:val="16"/>
+              </w:rPr>
+              <w:t xml:space="preserve">    2022 – 2024</w:t>
+            </w:r>
+          </w:p>
+          <w:p>
+            <w:pPr>
+              <w:spacing w:before="0" w:after="20" w:line="240" w:lineRule="exact"/>
+            </w:pPr>
+            <w:r>
+              <w:rPr>
+                <w:rFonts w:ascii="Calibri" w:hAnsi="Calibri"/>
+                <w:i/>
+                <w:color w:val="888888"/>
+                <w:sz w:val="17"/>
+              </w:rPr>
+              <w:t>ePandu Sdn Bhd</w:t>
+            </w:r>
+          </w:p>
+          <w:p>
+            <w:pPr>
+              <w:spacing w:before="0" w:after="0" w:line="250" w:lineRule="exact"/>
+            </w:pPr>
+            <w:r>
+              <w:rPr>
+                <w:rFonts w:ascii="Calibri" w:hAnsi="Calibri"/>
+                <w:color w:val="22C55E"/>
+                <w:sz w:val="16"/>
+              </w:rPr>
+              <w:t xml:space="preserve">  •  </w:t>
+            </w:r>
+            <w:r>
+              <w:rPr>
+                <w:rFonts w:ascii="Calibri" w:hAnsi="Calibri"/>
+                <w:color w:val="333333"/>
+                <w:sz w:val="16"/>
+              </w:rPr>
+              <w:t>Built job portal with merchant subscriptions generating recurring revenue</w:t>
+            </w:r>
+          </w:p>
+          <w:p>
+            <w:pPr>
+              <w:spacing w:before="0" w:after="0" w:line="250" w:lineRule="exact"/>
+            </w:pPr>
+            <w:r>
+              <w:rPr>
+                <w:rFonts w:ascii="Calibri" w:hAnsi="Calibri"/>
+                <w:color w:val="22C55E"/>
+                <w:sz w:val="16"/>
+              </w:rPr>
+              <w:t xml:space="preserve">  •  </w:t>
+            </w:r>
+            <w:r>
+              <w:rPr>
+                <w:rFonts w:ascii="Calibri" w:hAnsi="Calibri"/>
+                <w:color w:val="333333"/>
+                <w:sz w:val="16"/>
+              </w:rPr>
+              <w:t>Built full e-commerce platform — product management, payments, fulfillment</w:t>
+            </w:r>
+          </w:p>
+          <w:p>
+            <w:pPr>
+              <w:spacing w:before="100" w:after="0" w:line="260" w:lineRule="exact"/>
+            </w:pPr>
+            <w:r>
+              <w:rPr>
+                <w:rFonts w:ascii="Calibri" w:hAnsi="Calibri"/>
+                <w:b/>
+                <w:color w:val="111111"/>
+                <w:sz w:val="19"/>
+              </w:rPr>
+              <w:t>E-Commerce Developer</w:t>
+            </w:r>
+            <w:r>
+              <w:rPr>
+                <w:rFonts w:ascii="Calibri" w:hAnsi="Calibri"/>
+                <w:color w:val="22C55E"/>
+                <w:sz w:val="16"/>
+              </w:rPr>
+              <w:t xml:space="preserve">    2021</w:t>
+            </w:r>
+          </w:p>
+          <w:p>
+            <w:pPr>
+              <w:spacing w:before="0" w:after="20" w:line="240" w:lineRule="exact"/>
+            </w:pPr>
+            <w:r>
+              <w:rPr>
+                <w:rFonts w:ascii="Calibri" w:hAnsi="Calibri"/>
+                <w:i/>
+                <w:color w:val="888888"/>
+                <w:sz w:val="17"/>
+              </w:rPr>
+              <w:t>GAMA Supermarket &amp; Dept Store</w:t>
+            </w:r>
+          </w:p>
+          <w:p>
+            <w:pPr>
+              <w:spacing w:before="0" w:after="0" w:line="250" w:lineRule="exact"/>
+            </w:pPr>
+            <w:r>
+              <w:rPr>
+                <w:rFonts w:ascii="Calibri" w:hAnsi="Calibri"/>
+                <w:color w:val="22C55E"/>
+                <w:sz w:val="16"/>
+              </w:rPr>
+              <w:t xml:space="preserve">  •  </w:t>
+            </w:r>
+            <w:r>
+              <w:rPr>
+                <w:rFonts w:ascii="Calibri" w:hAnsi="Calibri"/>
+                <w:color w:val="333333"/>
+                <w:sz w:val="16"/>
+              </w:rPr>
+              <w:t>Built e-commerce platform from scratch for a major retail chain</w:t>
+            </w:r>
+          </w:p>
+          <w:p>
+            <w:pPr>
+              <w:spacing w:before="0" w:after="0" w:line="250" w:lineRule="exact"/>
+            </w:pPr>
+            <w:r>
+              <w:rPr>
+                <w:rFonts w:ascii="Calibri" w:hAnsi="Calibri"/>
+                <w:color w:val="22C55E"/>
+                <w:sz w:val="16"/>
+              </w:rPr>
+              <w:t xml:space="preserve">  •  </w:t>
+            </w:r>
+            <w:r>
+              <w:rPr>
+                <w:rFonts w:ascii="Calibri" w:hAnsi="Calibri"/>
+                <w:color w:val="333333"/>
+                <w:sz w:val="16"/>
+              </w:rPr>
+              <w:t>Managed department and cross-functional coordination</w:t>
+            </w:r>
+          </w:p>
+          <w:p>
+            <w:pPr>
+              <w:spacing w:before="100" w:after="0" w:line="260" w:lineRule="exact"/>
+            </w:pPr>
+            <w:r>
+              <w:rPr>
+                <w:rFonts w:ascii="Calibri" w:hAnsi="Calibri"/>
+                <w:b/>
+                <w:color w:val="111111"/>
+                <w:sz w:val="19"/>
+              </w:rPr>
+              <w:t>IT Support Specialist</w:t>
+            </w:r>
+            <w:r>
+              <w:rPr>
+                <w:rFonts w:ascii="Calibri" w:hAnsi="Calibri"/>
+                <w:color w:val="22C55E"/>
+                <w:sz w:val="16"/>
+              </w:rPr>
+              <w:t xml:space="preserve">    2019 – 2020</w:t>
+            </w:r>
+          </w:p>
+          <w:p>
+            <w:pPr>
+              <w:spacing w:before="0" w:after="20" w:line="240" w:lineRule="exact"/>
+            </w:pPr>
+            <w:r>
+              <w:rPr>
+                <w:rFonts w:ascii="Calibri" w:hAnsi="Calibri"/>
+                <w:i/>
+                <w:color w:val="888888"/>
+                <w:sz w:val="17"/>
+              </w:rPr>
+              <w:t>DISTED College</w:t>
+            </w:r>
+          </w:p>
+          <w:p>
+            <w:pPr>
+              <w:spacing w:before="0" w:after="0" w:line="250" w:lineRule="exact"/>
+            </w:pPr>
+            <w:r>
+              <w:rPr>
+                <w:rFonts w:ascii="Calibri" w:hAnsi="Calibri"/>
+                <w:color w:val="22C55E"/>
+                <w:sz w:val="16"/>
+              </w:rPr>
+              <w:t xml:space="preserve">  •  </w:t>
+            </w:r>
+            <w:r>
+              <w:rPr>
+                <w:rFonts w:ascii="Calibri" w:hAnsi="Calibri"/>
+                <w:color w:val="333333"/>
+                <w:sz w:val="16"/>
+              </w:rPr>
+              <w:t>Built library mgmt, ticketing, and knowledge base systems in-house</w:t>
+            </w:r>
+          </w:p>
+          <w:p>
+            <w:pPr>
+              <w:spacing w:before="0" w:after="0" w:line="250" w:lineRule="exact"/>
+            </w:pPr>
+            <w:r>
+              <w:rPr>
+                <w:rFonts w:ascii="Calibri" w:hAnsi="Calibri"/>
+                <w:color w:val="22C55E"/>
+                <w:sz w:val="16"/>
+              </w:rPr>
+              <w:t xml:space="preserve">  •  </w:t>
+            </w:r>
+            <w:r>
+              <w:rPr>
+                <w:rFonts w:ascii="Calibri" w:hAnsi="Calibri"/>
+                <w:color w:val="333333"/>
+                <w:sz w:val="16"/>
+              </w:rPr>
+              <w:t>Automated audit processes. Maintained ISO 9001</w:t>
+            </w:r>
+          </w:p>
+          <w:p>
+            <w:pPr>
+              <w:spacing w:before="100" w:after="0" w:line="260" w:lineRule="exact"/>
+            </w:pPr>
+            <w:r>
+              <w:rPr>
+                <w:rFonts w:ascii="Calibri" w:hAnsi="Calibri"/>
+                <w:b/>
+                <w:color w:val="111111"/>
+                <w:sz w:val="19"/>
+              </w:rPr>
+              <w:t>Asst. IT Supervisor</w:t>
+            </w:r>
+            <w:r>
+              <w:rPr>
+                <w:rFonts w:ascii="Calibri" w:hAnsi="Calibri"/>
+                <w:color w:val="22C55E"/>
+                <w:sz w:val="16"/>
+              </w:rPr>
+              <w:t xml:space="preserve">    2016 – 2018</w:t>
+            </w:r>
+          </w:p>
+          <w:p>
+            <w:pPr>
+              <w:spacing w:before="0" w:after="20" w:line="240" w:lineRule="exact"/>
+            </w:pPr>
+            <w:r>
+              <w:rPr>
+                <w:rFonts w:ascii="Calibri" w:hAnsi="Calibri"/>
+                <w:i/>
+                <w:color w:val="888888"/>
+                <w:sz w:val="17"/>
+              </w:rPr>
+              <w:t>GAMA Supermarket &amp; Dept Store</w:t>
+            </w:r>
+          </w:p>
+          <w:p>
+            <w:pPr>
+              <w:spacing w:before="0" w:after="0" w:line="250" w:lineRule="exact"/>
+            </w:pPr>
+            <w:r>
+              <w:rPr>
+                <w:rFonts w:ascii="Calibri" w:hAnsi="Calibri"/>
+                <w:color w:val="22C55E"/>
+                <w:sz w:val="16"/>
+              </w:rPr>
+              <w:t xml:space="preserve">  •  </w:t>
+            </w:r>
+            <w:r>
+              <w:rPr>
+                <w:rFonts w:ascii="Calibri" w:hAnsi="Calibri"/>
+                <w:color w:val="333333"/>
+                <w:sz w:val="16"/>
+              </w:rPr>
+              <w:t>Led company-wide POS deployment. Built ticketing and knowledge base systems</w:t>
+            </w:r>
+          </w:p>
+          <w:p>
+            <w:pPr>
+              <w:spacing w:before="100" w:after="0" w:line="260" w:lineRule="exact"/>
+            </w:pPr>
+            <w:r>
+              <w:rPr>
+                <w:rFonts w:ascii="Calibri" w:hAnsi="Calibri"/>
+                <w:b/>
+                <w:color w:val="111111"/>
+                <w:sz w:val="19"/>
+              </w:rPr>
+              <w:t>Software Engineer</w:t>
+            </w:r>
+            <w:r>
+              <w:rPr>
+                <w:rFonts w:ascii="Calibri" w:hAnsi="Calibri"/>
+                <w:color w:val="22C55E"/>
+                <w:sz w:val="16"/>
+              </w:rPr>
+              <w:t xml:space="preserve">    2012 – 2015</w:t>
+            </w:r>
+          </w:p>
+          <w:p>
+            <w:pPr>
+              <w:spacing w:before="0" w:after="20" w:line="240" w:lineRule="exact"/>
+            </w:pPr>
+            <w:r>
+              <w:rPr>
+                <w:rFonts w:ascii="Calibri" w:hAnsi="Calibri"/>
+                <w:i/>
+                <w:color w:val="888888"/>
+                <w:sz w:val="17"/>
+              </w:rPr>
+              <w:t>UniKL Resources Sdn Bhd</w:t>
+            </w:r>
+          </w:p>
+          <w:p>
+            <w:pPr>
+              <w:spacing w:before="0" w:after="0" w:line="250" w:lineRule="exact"/>
+            </w:pPr>
+            <w:r>
+              <w:rPr>
+                <w:rFonts w:ascii="Calibri" w:hAnsi="Calibri"/>
+                <w:color w:val="22C55E"/>
+                <w:sz w:val="16"/>
+              </w:rPr>
+              <w:t xml:space="preserve">  •  </w:t>
+            </w:r>
+            <w:r>
+              <w:rPr>
+                <w:rFonts w:ascii="Calibri" w:hAnsi="Calibri"/>
+                <w:color w:val="333333"/>
+                <w:sz w:val="16"/>
+              </w:rPr>
+              <w:t>Built financial system for MARA (government agency)</w:t>
+            </w:r>
+          </w:p>
+          <w:p>
+            <w:pPr>
+              <w:spacing w:before="0" w:after="0" w:line="250" w:lineRule="exact"/>
+            </w:pPr>
+            <w:r>
+              <w:rPr>
+                <w:rFonts w:ascii="Calibri" w:hAnsi="Calibri"/>
+                <w:color w:val="22C55E"/>
+                <w:sz w:val="16"/>
+              </w:rPr>
+              <w:t xml:space="preserve">  •  </w:t>
+            </w:r>
+            <w:r>
+              <w:rPr>
+                <w:rFonts w:ascii="Calibri" w:hAnsi="Calibri"/>
+                <w:color w:val="333333"/>
+                <w:sz w:val="16"/>
+              </w:rPr>
+              <w:t>Web services for e-Perolehan. Extended MS Dynamics AX</w:t>
+            </w:r>
+          </w:p>
+          <w:p>
+            <w:pPr>
+              <w:spacing w:before="160" w:after="60" w:line="280" w:lineRule="exact"/>
+              <w:pBdr>
+                <w:bottom w:val="single" w:sz="4" w:space="1" w:color="22C55E"/>
+              </w:pBdr>
+            </w:pPr>
+            <w:r>
+              <w:rPr>
+                <w:rFonts w:ascii="Calibri" w:hAnsi="Calibri"/>
+                <w:b/>
+                <w:color w:val="22C55E"/>
+                <w:sz w:val="18"/>
+              </w:rPr>
+              <w:t>FEATURED PROJECTS</w:t>
+            </w:r>
+          </w:p>
+          <w:p>
+            <w:pPr>
+              <w:spacing w:before="60" w:after="0" w:line="240" w:lineRule="exact"/>
+            </w:pPr>
+            <w:r>
+              <w:rPr>
+                <w:rFonts w:ascii="Calibri" w:hAnsi="Calibri"/>
+                <w:b/>
+                <w:color w:val="111111"/>
+                <w:sz w:val="17"/>
+              </w:rPr>
+              <w:t>EOIOT — Enterprise ERP for Palm Oil</w:t>
+            </w:r>
+          </w:p>
+          <w:p>
+            <w:pPr>
+              <w:spacing w:before="0" w:after="0" w:line="240" w:lineRule="exact"/>
+            </w:pPr>
+            <w:r>
+              <w:rPr>
+                <w:rFonts w:ascii="Calibri" w:hAnsi="Calibri"/>
+                <w:b w:val="0"/>
+                <w:i w:val="0"/>
+                <w:color w:val="888888"/>
+                <w:sz w:val="16"/>
+              </w:rPr>
+              <w:t>Full-scale ERP replacing SAP/Navision. SCM, finance, HR, procurement, refinery ops.</w:t>
+            </w:r>
+          </w:p>
+          <w:p>
+            <w:pPr>
+              <w:spacing w:before="0" w:after="0" w:line="220" w:lineRule="exact"/>
+            </w:pPr>
+            <w:r>
+              <w:rPr>
+                <w:rFonts w:ascii="Calibri" w:hAnsi="Calibri"/>
+                <w:b w:val="0"/>
+                <w:i/>
+                <w:color w:val="999999"/>
+                <w:sz w:val="14"/>
+              </w:rPr>
+              <w:t>Stack: Nuxt · Vue · Python · Prisma · PostgreSQL</w:t>
+            </w:r>
+          </w:p>
+          <w:p>
+            <w:pPr>
+              <w:spacing w:before="60" w:after="0" w:line="240" w:lineRule="exact"/>
+            </w:pPr>
+            <w:r>
+              <w:rPr>
+                <w:rFonts w:ascii="Calibri" w:hAnsi="Calibri"/>
+                <w:b/>
+                <w:color w:val="111111"/>
+                <w:sz w:val="17"/>
+              </w:rPr>
+              <w:t>TradeAI — AI Forex Trading System</w:t>
+            </w:r>
+          </w:p>
+          <w:p>
+            <w:pPr>
+              <w:spacing w:before="0" w:after="0" w:line="240" w:lineRule="exact"/>
+            </w:pPr>
+            <w:r>
+              <w:rPr>
+                <w:rFonts w:ascii="Calibri" w:hAnsi="Calibri"/>
+                <w:b w:val="0"/>
+                <w:i w:val="0"/>
+                <w:color w:val="888888"/>
+                <w:sz w:val="16"/>
+              </w:rPr>
+              <w:t>ML-powered forex prediction generating calibrated BUY/SELL probabilities from historical data.</w:t>
+            </w:r>
+          </w:p>
+          <w:p>
+            <w:pPr>
+              <w:spacing w:before="0" w:after="0" w:line="220" w:lineRule="exact"/>
+            </w:pPr>
+            <w:r>
+              <w:rPr>
+                <w:rFonts w:ascii="Calibri" w:hAnsi="Calibri"/>
+                <w:b w:val="0"/>
+                <w:i/>
+                <w:color w:val="999999"/>
+                <w:sz w:val="14"/>
+              </w:rPr>
+              <w:t>Stack: Python · FastAPI · Scikit-Learn · Pandas</w:t>
+            </w:r>
+          </w:p>
+          <w:p>
+            <w:pPr>
+              <w:spacing w:before="60" w:after="0" w:line="240" w:lineRule="exact"/>
+            </w:pPr>
+            <w:r>
+              <w:rPr>
+                <w:rFonts w:ascii="Calibri" w:hAnsi="Calibri"/>
+                <w:b/>
+                <w:color w:val="111111"/>
+                <w:sz w:val="17"/>
+              </w:rPr>
+              <w:t>EMS — Engineering Management SaaS</w:t>
+            </w:r>
+          </w:p>
+          <w:p>
+            <w:pPr>
+              <w:spacing w:before="0" w:after="0" w:line="240" w:lineRule="exact"/>
+            </w:pPr>
+            <w:r>
+              <w:rPr>
+                <w:rFonts w:ascii="Calibri" w:hAnsi="Calibri"/>
+                <w:b w:val="0"/>
+                <w:i w:val="0"/>
+                <w:color w:val="888888"/>
+                <w:sz w:val="16"/>
+              </w:rPr>
+              <w:t>Platform for managing teams and projects with proper engineering standards.</w:t>
+            </w:r>
+          </w:p>
+          <w:p>
+            <w:pPr>
+              <w:spacing w:before="0" w:after="0" w:line="220" w:lineRule="exact"/>
+            </w:pPr>
+            <w:r>
+              <w:rPr>
+                <w:rFonts w:ascii="Calibri" w:hAnsi="Calibri"/>
+                <w:b w:val="0"/>
+                <w:i/>
+                <w:color w:val="999999"/>
+                <w:sz w:val="14"/>
+              </w:rPr>
+              <w:t>Stack: Nuxt · Vue · Vuetify · Prisma · TypeScript</w:t>
+            </w:r>
+          </w:p>
+          <w:p>
+            <w:pPr>
+              <w:spacing w:before="60" w:after="0" w:line="240" w:lineRule="exact"/>
+            </w:pPr>
+            <w:r>
+              <w:rPr>
+                <w:rFonts w:ascii="Calibri" w:hAnsi="Calibri"/>
+                <w:b/>
+                <w:color w:val="111111"/>
+                <w:sz w:val="17"/>
+              </w:rPr>
+              <w:t>Second Brain — AI Knowledge System</w:t>
+            </w:r>
+          </w:p>
+          <w:p>
+            <w:pPr>
+              <w:spacing w:before="0" w:after="0" w:line="240" w:lineRule="exact"/>
+            </w:pPr>
+            <w:r>
+              <w:rPr>
+                <w:rFonts w:ascii="Calibri" w:hAnsi="Calibri"/>
+                <w:b w:val="0"/>
+                <w:i w:val="0"/>
+                <w:color w:val="888888"/>
+                <w:sz w:val="16"/>
+              </w:rPr>
+              <w:t>AI system processing 125,000+ documents with semantic search, knowledge graphs, and automated ingestion.</w:t>
+            </w:r>
+          </w:p>
+          <w:p>
+            <w:pPr>
+              <w:spacing w:before="0" w:after="0" w:line="220" w:lineRule="exact"/>
+            </w:pPr>
+            <w:r>
+              <w:rPr>
+                <w:rFonts w:ascii="Calibri" w:hAnsi="Calibri"/>
+                <w:b w:val="0"/>
+                <w:i/>
+                <w:color w:val="999999"/>
+                <w:sz w:val="14"/>
+              </w:rPr>
+              <w:t>Stack: Python · ChromaDB · LLM · FastAPI · SQLite</w:t>
+            </w:r>
+          </w:p>
+          <w:p>
+            <w:pPr>
+              <w:spacing w:before="160" w:after="60" w:line="280" w:lineRule="exact"/>
+              <w:pBdr>
+                <w:bottom w:val="single" w:sz="4" w:space="1" w:color="22C55E"/>
+              </w:pBdr>
+            </w:pPr>
+            <w:r>
+              <w:rPr>
+                <w:rFonts w:ascii="Calibri" w:hAnsi="Calibri"/>
+                <w:b/>
+                <w:color w:val="22C55E"/>
+                <w:sz w:val="18"/>
+              </w:rPr>
+              <w:t>WHY HIRE ME</w:t>
+            </w:r>
+          </w:p>
+          <w:p>
+            <w:pPr>
+              <w:spacing w:before="40" w:after="80" w:line="260" w:lineRule="exact"/>
+            </w:pPr>
+            <w:r>
+              <w:rPr>
+                <w:rFonts w:ascii="Calibri" w:hAnsi="Calibri"/>
+                <w:color w:val="166534"/>
+                <w:sz w:val="17"/>
+              </w:rPr>
+              <w:t xml:space="preserve">I replaced SAP with a custom ERP. I built 4 production systems from zero. 15 years of self-taught engineering across 6 industries. I lead teams, architect solutions, and ship code that works. </w:t>
+            </w:r>
+            <w:r>
+              <w:rPr>
+                <w:rFonts w:ascii="Calibri" w:hAnsi="Calibri"/>
+                <w:b/>
+                <w:color w:val="166534"/>
+                <w:sz w:val="17"/>
+              </w:rPr>
+              <w:t>Most engineers write code. I build businesses.</w:t>
+            </w:r>
+          </w:p>
+        </w:tc>
+      </w:tr>
+    </w:tbl>
     <w:sectPr>
       <w:pgSz w:w="12240" w:h="15840"/>
-      <w:pgMar w:top="850" w:right="850" w:bottom="850" w:left="850" w:header="720" w:footer="720" w:gutter="0"/>
+      <w:pgMar w:top="0" w:right="0" w:bottom="0" w:left="0" w:header="720" w:footer="720" w:gutter="0"/>
       <w:cols w:space="720"/>
       <w:docGrid w:linePitch="360"/>
     </w:sectPr>
@@ -1110,11 +1770,6 @@
     <w:name w:val="Normal"/>
     <w:qFormat/>
     <w:rsid w:val="00FC693F"/>
-    <w:rPr>
-      <w:rFonts w:ascii="Calibri" w:hAnsi="Calibri"/>
-      <w:color w:val="333333"/>
-      <w:sz w:val="21"/>
-    </w:rPr>
   </w:style>
   <w:style w:type="paragraph" w:styleId="Header">
     <w:name w:val="header"/>

</xml_diff>

<commit_message>
fix(docx): regenerate with two-column layout + correct portfolio URL
</commit_message>
<xml_diff>
--- a/Mohamad_Firdaus_Resume_2026.docx
+++ b/Mohamad_Firdaus_Resume_2026.docx
@@ -4,13 +4,12 @@
   <w:body>
     <w:tbl>
       <w:tblGrid>
-        <w:gridCol w:w="3800"/>
-        <w:gridCol w:w="13200"/>
+        <w:gridCol w:w="4000"/>
+        <w:gridCol w:w="13000"/>
       </w:tblGrid>
       <w:tblPr>
         <w:tblW w:type="auto" w:w="0"/>
         <w:jc w:val="center"/>
-        <w:tblLayout w:type="autofit"/>
         <w:tblLook w:firstColumn="1" w:firstRow="1" w:lastColumn="0" w:lastRow="0" w:noHBand="0" w:noVBand="1" w:val="04A0"/>
         <w:tblW w:w="17000" w:type="dxa"/>
       </w:tblPr>
@@ -23,28 +22,30 @@
           <w:tcPr>
             <w:tcW w:type="dxa" w:w="4680"/>
             <w:shd w:fill="1a1a2e" w:val="clear"/>
+            <w:tcMar>
+              <w:top w:w="60" w:type="dxa"/>
+              <w:left w:w="80" w:type="dxa"/>
+              <w:bottom w:w="60" w:type="dxa"/>
+              <w:right w:w="80" w:type="dxa"/>
+            </w:tcMar>
           </w:tcPr>
+          <w:p/>
           <w:p>
             <w:pPr>
-              <w:spacing w:before="0" w:after="0"/>
-            </w:pPr>
-          </w:p>
-          <w:p>
-            <w:pPr>
-              <w:spacing w:before="0" w:after="0" w:line="240" w:lineRule="exact"/>
+              <w:spacing w:before="0" w:after="0" w:line="220" w:lineRule="exact"/>
             </w:pPr>
             <w:r>
               <w:rPr>
                 <w:rFonts w:ascii="Calibri" w:hAnsi="Calibri"/>
                 <w:b w:val="0"/>
                 <w:color w:val="BBBBBB"/>
-                <w:sz w:val="12"/>
+                <w:sz w:val="8"/>
               </w:rPr>
             </w:r>
           </w:p>
           <w:p>
             <w:pPr>
-              <w:spacing w:before="240" w:after="60" w:line="260" w:lineRule="exact"/>
+              <w:spacing w:before="200" w:after="60" w:line="20" w:lineRule="exact"/>
               <w:pBdr>
                 <w:bottom w:val="single" w:sz="4" w:space="1" w:color="22C55E"/>
               </w:pBdr>
@@ -145,7 +146,7 @@
           </w:p>
           <w:p>
             <w:pPr>
-              <w:spacing w:before="240" w:after="60" w:line="260" w:lineRule="exact"/>
+              <w:spacing w:before="200" w:after="60" w:line="20" w:lineRule="exact"/>
               <w:pBdr>
                 <w:bottom w:val="single" w:sz="4" w:space="1" w:color="22C55E"/>
               </w:pBdr>
@@ -162,12 +163,11 @@
           </w:p>
           <w:p>
             <w:pPr>
-              <w:spacing w:before="0" w:after="0" w:line="220" w:lineRule="exact"/>
+              <w:spacing w:before="0" w:after="0" w:line="200" w:lineRule="exact"/>
             </w:pPr>
             <w:r>
               <w:rPr>
                 <w:rFonts w:ascii="Calibri" w:hAnsi="Calibri"/>
-                <w:b w:val="0"/>
                 <w:color w:val="4ADE80"/>
                 <w:sz w:val="13"/>
               </w:rPr>
@@ -176,12 +176,11 @@
           </w:p>
           <w:p>
             <w:pPr>
-              <w:spacing w:before="0" w:after="0" w:line="220" w:lineRule="exact"/>
+              <w:spacing w:before="0" w:after="0" w:line="200" w:lineRule="exact"/>
             </w:pPr>
             <w:r>
               <w:rPr>
                 <w:rFonts w:ascii="Calibri" w:hAnsi="Calibri"/>
-                <w:b w:val="0"/>
                 <w:color w:val="4ADE80"/>
                 <w:sz w:val="13"/>
               </w:rPr>
@@ -190,12 +189,11 @@
           </w:p>
           <w:p>
             <w:pPr>
-              <w:spacing w:before="0" w:after="0" w:line="220" w:lineRule="exact"/>
+              <w:spacing w:before="0" w:after="0" w:line="200" w:lineRule="exact"/>
             </w:pPr>
             <w:r>
               <w:rPr>
                 <w:rFonts w:ascii="Calibri" w:hAnsi="Calibri"/>
-                <w:b w:val="0"/>
                 <w:color w:val="4ADE80"/>
                 <w:sz w:val="13"/>
               </w:rPr>
@@ -204,12 +202,11 @@
           </w:p>
           <w:p>
             <w:pPr>
-              <w:spacing w:before="0" w:after="0" w:line="220" w:lineRule="exact"/>
+              <w:spacing w:before="0" w:after="0" w:line="200" w:lineRule="exact"/>
             </w:pPr>
             <w:r>
               <w:rPr>
                 <w:rFonts w:ascii="Calibri" w:hAnsi="Calibri"/>
-                <w:b w:val="0"/>
                 <w:color w:val="4ADE80"/>
                 <w:sz w:val="13"/>
               </w:rPr>
@@ -218,12 +215,11 @@
           </w:p>
           <w:p>
             <w:pPr>
-              <w:spacing w:before="0" w:after="0" w:line="220" w:lineRule="exact"/>
+              <w:spacing w:before="0" w:after="0" w:line="200" w:lineRule="exact"/>
             </w:pPr>
             <w:r>
               <w:rPr>
                 <w:rFonts w:ascii="Calibri" w:hAnsi="Calibri"/>
-                <w:b w:val="0"/>
                 <w:color w:val="4ADE80"/>
                 <w:sz w:val="13"/>
               </w:rPr>
@@ -232,12 +228,11 @@
           </w:p>
           <w:p>
             <w:pPr>
-              <w:spacing w:before="0" w:after="0" w:line="220" w:lineRule="exact"/>
+              <w:spacing w:before="0" w:after="0" w:line="200" w:lineRule="exact"/>
             </w:pPr>
             <w:r>
               <w:rPr>
                 <w:rFonts w:ascii="Calibri" w:hAnsi="Calibri"/>
-                <w:b w:val="0"/>
                 <w:color w:val="4ADE80"/>
                 <w:sz w:val="13"/>
               </w:rPr>
@@ -246,12 +241,11 @@
           </w:p>
           <w:p>
             <w:pPr>
-              <w:spacing w:before="0" w:after="0" w:line="220" w:lineRule="exact"/>
+              <w:spacing w:before="0" w:after="0" w:line="200" w:lineRule="exact"/>
             </w:pPr>
             <w:r>
               <w:rPr>
                 <w:rFonts w:ascii="Calibri" w:hAnsi="Calibri"/>
-                <w:b w:val="0"/>
                 <w:color w:val="4ADE80"/>
                 <w:sz w:val="13"/>
               </w:rPr>
@@ -260,12 +254,11 @@
           </w:p>
           <w:p>
             <w:pPr>
-              <w:spacing w:before="0" w:after="0" w:line="220" w:lineRule="exact"/>
+              <w:spacing w:before="0" w:after="0" w:line="200" w:lineRule="exact"/>
             </w:pPr>
             <w:r>
               <w:rPr>
                 <w:rFonts w:ascii="Calibri" w:hAnsi="Calibri"/>
-                <w:b w:val="0"/>
                 <w:color w:val="4ADE80"/>
                 <w:sz w:val="13"/>
               </w:rPr>
@@ -274,12 +267,11 @@
           </w:p>
           <w:p>
             <w:pPr>
-              <w:spacing w:before="0" w:after="0" w:line="220" w:lineRule="exact"/>
+              <w:spacing w:before="0" w:after="0" w:line="200" w:lineRule="exact"/>
             </w:pPr>
             <w:r>
               <w:rPr>
                 <w:rFonts w:ascii="Calibri" w:hAnsi="Calibri"/>
-                <w:b w:val="0"/>
                 <w:color w:val="4ADE80"/>
                 <w:sz w:val="13"/>
               </w:rPr>
@@ -288,12 +280,11 @@
           </w:p>
           <w:p>
             <w:pPr>
-              <w:spacing w:before="0" w:after="0" w:line="220" w:lineRule="exact"/>
+              <w:spacing w:before="0" w:after="0" w:line="200" w:lineRule="exact"/>
             </w:pPr>
             <w:r>
               <w:rPr>
                 <w:rFonts w:ascii="Calibri" w:hAnsi="Calibri"/>
-                <w:b w:val="0"/>
                 <w:color w:val="4ADE80"/>
                 <w:sz w:val="13"/>
               </w:rPr>
@@ -302,12 +293,11 @@
           </w:p>
           <w:p>
             <w:pPr>
-              <w:spacing w:before="0" w:after="0" w:line="220" w:lineRule="exact"/>
+              <w:spacing w:before="0" w:after="0" w:line="200" w:lineRule="exact"/>
             </w:pPr>
             <w:r>
               <w:rPr>
                 <w:rFonts w:ascii="Calibri" w:hAnsi="Calibri"/>
-                <w:b w:val="0"/>
                 <w:color w:val="4ADE80"/>
                 <w:sz w:val="13"/>
               </w:rPr>
@@ -316,12 +306,11 @@
           </w:p>
           <w:p>
             <w:pPr>
-              <w:spacing w:before="0" w:after="0" w:line="220" w:lineRule="exact"/>
+              <w:spacing w:before="0" w:after="0" w:line="200" w:lineRule="exact"/>
             </w:pPr>
             <w:r>
               <w:rPr>
                 <w:rFonts w:ascii="Calibri" w:hAnsi="Calibri"/>
-                <w:b w:val="0"/>
                 <w:color w:val="4ADE80"/>
                 <w:sz w:val="13"/>
               </w:rPr>
@@ -330,12 +319,11 @@
           </w:p>
           <w:p>
             <w:pPr>
-              <w:spacing w:before="0" w:after="0" w:line="220" w:lineRule="exact"/>
+              <w:spacing w:before="0" w:after="0" w:line="200" w:lineRule="exact"/>
             </w:pPr>
             <w:r>
               <w:rPr>
                 <w:rFonts w:ascii="Calibri" w:hAnsi="Calibri"/>
-                <w:b w:val="0"/>
                 <w:color w:val="4ADE80"/>
                 <w:sz w:val="13"/>
               </w:rPr>
@@ -344,12 +332,11 @@
           </w:p>
           <w:p>
             <w:pPr>
-              <w:spacing w:before="0" w:after="0" w:line="220" w:lineRule="exact"/>
+              <w:spacing w:before="0" w:after="0" w:line="200" w:lineRule="exact"/>
             </w:pPr>
             <w:r>
               <w:rPr>
                 <w:rFonts w:ascii="Calibri" w:hAnsi="Calibri"/>
-                <w:b w:val="0"/>
                 <w:color w:val="4ADE80"/>
                 <w:sz w:val="13"/>
               </w:rPr>
@@ -358,7 +345,7 @@
           </w:p>
           <w:p>
             <w:pPr>
-              <w:spacing w:before="240" w:after="60" w:line="260" w:lineRule="exact"/>
+              <w:spacing w:before="200" w:after="60" w:line="20" w:lineRule="exact"/>
               <w:pBdr>
                 <w:bottom w:val="single" w:sz="4" w:space="1" w:color="22C55E"/>
               </w:pBdr>
@@ -375,7 +362,7 @@
           </w:p>
           <w:p>
             <w:pPr>
-              <w:spacing w:before="0" w:after="0" w:line="240" w:lineRule="exact"/>
+              <w:spacing w:before="0" w:after="0" w:line="220" w:lineRule="exact"/>
             </w:pPr>
             <w:r>
               <w:rPr>
@@ -389,7 +376,7 @@
           </w:p>
           <w:p>
             <w:pPr>
-              <w:spacing w:before="0" w:after="0" w:line="230" w:lineRule="exact"/>
+              <w:spacing w:before="0" w:after="0" w:line="210" w:lineRule="exact"/>
             </w:pPr>
             <w:r>
               <w:rPr>
@@ -402,7 +389,7 @@
           </w:p>
           <w:p>
             <w:pPr>
-              <w:spacing w:before="0" w:after="0" w:line="230" w:lineRule="exact"/>
+              <w:spacing w:before="0" w:after="0" w:line="210" w:lineRule="exact"/>
             </w:pPr>
             <w:r>
               <w:rPr>
@@ -415,7 +402,7 @@
           </w:p>
           <w:p>
             <w:pPr>
-              <w:spacing w:before="0" w:after="0" w:line="230" w:lineRule="exact"/>
+              <w:spacing w:before="0" w:after="0" w:line="210" w:lineRule="exact"/>
             </w:pPr>
             <w:r>
               <w:rPr>
@@ -428,7 +415,7 @@
           </w:p>
           <w:p>
             <w:pPr>
-              <w:spacing w:before="0" w:after="0" w:line="230" w:lineRule="exact"/>
+              <w:spacing w:before="0" w:after="0" w:line="210" w:lineRule="exact"/>
             </w:pPr>
             <w:r>
               <w:rPr>
@@ -441,7 +428,7 @@
           </w:p>
           <w:p>
             <w:pPr>
-              <w:spacing w:before="240" w:after="60" w:line="260" w:lineRule="exact"/>
+              <w:spacing w:before="200" w:after="60" w:line="20" w:lineRule="exact"/>
               <w:pBdr>
                 <w:bottom w:val="single" w:sz="4" w:space="1" w:color="22C55E"/>
               </w:pBdr>
@@ -458,7 +445,7 @@
           </w:p>
           <w:p>
             <w:pPr>
-              <w:spacing w:before="0" w:after="0" w:line="230" w:lineRule="exact"/>
+              <w:spacing w:before="0" w:after="0" w:line="210" w:lineRule="exact"/>
             </w:pPr>
             <w:r>
               <w:rPr>
@@ -471,7 +458,7 @@
           </w:p>
           <w:p>
             <w:pPr>
-              <w:spacing w:before="0" w:after="0" w:line="230" w:lineRule="exact"/>
+              <w:spacing w:before="0" w:after="0" w:line="210" w:lineRule="exact"/>
             </w:pPr>
             <w:r>
               <w:rPr>
@@ -484,7 +471,7 @@
           </w:p>
           <w:p>
             <w:pPr>
-              <w:spacing w:before="0" w:after="0" w:line="230" w:lineRule="exact"/>
+              <w:spacing w:before="0" w:after="0" w:line="210" w:lineRule="exact"/>
             </w:pPr>
             <w:r>
               <w:rPr>
@@ -497,7 +484,7 @@
           </w:p>
           <w:p>
             <w:pPr>
-              <w:spacing w:before="0" w:after="0" w:line="230" w:lineRule="exact"/>
+              <w:spacing w:before="0" w:after="0" w:line="210" w:lineRule="exact"/>
             </w:pPr>
             <w:r>
               <w:rPr>
@@ -510,7 +497,7 @@
           </w:p>
           <w:p>
             <w:pPr>
-              <w:spacing w:before="240" w:after="60" w:line="260" w:lineRule="exact"/>
+              <w:spacing w:before="200" w:after="60" w:line="20" w:lineRule="exact"/>
               <w:pBdr>
                 <w:bottom w:val="single" w:sz="4" w:space="1" w:color="22C55E"/>
               </w:pBdr>
@@ -557,29 +544,25 @@
         <w:tc>
           <w:tcPr>
             <w:tcW w:type="dxa" w:w="4680"/>
-            <w:shd w:fill="ffffff" w:val="clear"/>
           </w:tcPr>
+          <w:p/>
           <w:p>
             <w:pPr>
-              <w:spacing w:before="0" w:after="0"/>
-            </w:pPr>
-          </w:p>
-          <w:p>
-            <w:pPr>
-              <w:spacing w:before="0" w:after="0" w:line="240" w:lineRule="exact"/>
+              <w:spacing w:before="0" w:after="0" w:line="260" w:lineRule="exact"/>
             </w:pPr>
             <w:r>
               <w:rPr>
                 <w:rFonts w:ascii="Calibri" w:hAnsi="Calibri"/>
                 <w:b w:val="0"/>
-                <w:color w:val="BBBBBB"/>
+                <w:i w:val="0"/>
+                <w:color w:val="333333"/>
                 <w:sz w:val="8"/>
               </w:rPr>
             </w:r>
           </w:p>
           <w:p>
             <w:pPr>
-              <w:spacing w:before="0" w:after="0" w:line="400" w:lineRule="exact"/>
+              <w:spacing w:before="0" w:after="0" w:line="20" w:lineRule="exact"/>
             </w:pPr>
             <w:r>
               <w:rPr>
@@ -593,7 +576,7 @@
           </w:p>
           <w:p>
             <w:pPr>
-              <w:spacing w:before="0" w:after="0"/>
+              <w:spacing w:before="0" w:after="0" w:line="20" w:lineRule="exact"/>
             </w:pPr>
             <w:r>
               <w:rPr>
@@ -607,7 +590,7 @@
           </w:p>
           <w:p>
             <w:pPr>
-              <w:spacing w:before="0" w:after="80"/>
+              <w:spacing w:before="0" w:after="0" w:line="20" w:lineRule="exact"/>
             </w:pPr>
             <w:r>
               <w:rPr>
@@ -620,7 +603,7 @@
           </w:p>
           <w:p>
             <w:pPr>
-              <w:spacing w:before="0" w:after="80"/>
+              <w:spacing w:before="80" w:after="80" w:line="20" w:lineRule="exact"/>
               <w:pBdr>
                 <w:bottom w:val="single" w:sz="8" w:space="1" w:color="22C55E"/>
               </w:pBdr>
@@ -628,7 +611,7 @@
           </w:p>
           <w:p>
             <w:pPr>
-              <w:spacing w:before="160" w:after="60" w:line="280" w:lineRule="exact"/>
+              <w:spacing w:before="160" w:after="60" w:line="20" w:lineRule="exact"/>
               <w:pBdr>
                 <w:bottom w:val="single" w:sz="4" w:space="1" w:color="22C55E"/>
               </w:pBdr>
@@ -645,11 +628,13 @@
           </w:p>
           <w:p>
             <w:pPr>
-              <w:spacing w:before="0" w:after="80" w:line="260" w:lineRule="exact"/>
+              <w:spacing w:before="0" w:after="0" w:line="260" w:lineRule="exact"/>
             </w:pPr>
             <w:r>
               <w:rPr>
                 <w:rFonts w:ascii="Calibri" w:hAnsi="Calibri"/>
+                <w:b w:val="0"/>
+                <w:i w:val="0"/>
                 <w:color w:val="166534"/>
                 <w:sz w:val="17"/>
               </w:rPr>
@@ -658,7 +643,7 @@
           </w:p>
           <w:p>
             <w:pPr>
-              <w:spacing w:before="160" w:after="60" w:line="280" w:lineRule="exact"/>
+              <w:spacing w:before="160" w:after="60" w:line="20" w:lineRule="exact"/>
               <w:pBdr>
                 <w:bottom w:val="single" w:sz="4" w:space="1" w:color="22C55E"/>
               </w:pBdr>
@@ -675,7 +660,7 @@
           </w:p>
           <w:p>
             <w:pPr>
-              <w:spacing w:before="100" w:after="0" w:line="260" w:lineRule="exact"/>
+              <w:spacing w:before="80" w:after="0" w:line="20" w:lineRule="exact"/>
             </w:pPr>
             <w:r>
               <w:rPr>
@@ -689,21 +674,23 @@
             <w:r>
               <w:rPr>
                 <w:rFonts w:ascii="Calibri" w:hAnsi="Calibri"/>
+                <w:b/>
                 <w:color w:val="22C55E"/>
                 <w:sz w:val="16"/>
               </w:rPr>
-              <w:t xml:space="preserve">    2024 – Present</w:t>
+              <w:t xml:space="preserve">   2024 – Present</w:t>
             </w:r>
           </w:p>
           <w:p>
             <w:pPr>
-              <w:spacing w:before="0" w:after="20" w:line="240" w:lineRule="exact"/>
+              <w:spacing w:before="0" w:after="0" w:line="240" w:lineRule="exact"/>
             </w:pPr>
             <w:r>
               <w:rPr>
                 <w:rFonts w:ascii="Calibri" w:hAnsi="Calibri"/>
+                <w:b w:val="0"/>
                 <w:i/>
-                <w:color w:val="888888"/>
+                <w:color w:val="555555"/>
                 <w:sz w:val="17"/>
               </w:rPr>
               <w:t>GlobalIoT Sdn Bhd</w:t>
@@ -711,7 +698,7 @@
           </w:p>
           <w:p>
             <w:pPr>
-              <w:spacing w:before="0" w:after="0" w:line="250" w:lineRule="exact"/>
+              <w:spacing w:before="0" w:after="0" w:line="240" w:lineRule="exact"/>
             </w:pPr>
             <w:r>
               <w:rPr>
@@ -732,7 +719,7 @@
           </w:p>
           <w:p>
             <w:pPr>
-              <w:spacing w:before="0" w:after="0" w:line="250" w:lineRule="exact"/>
+              <w:spacing w:before="0" w:after="0" w:line="240" w:lineRule="exact"/>
             </w:pPr>
             <w:r>
               <w:rPr>
@@ -753,7 +740,7 @@
           </w:p>
           <w:p>
             <w:pPr>
-              <w:spacing w:before="0" w:after="0" w:line="250" w:lineRule="exact"/>
+              <w:spacing w:before="0" w:after="0" w:line="240" w:lineRule="exact"/>
             </w:pPr>
             <w:r>
               <w:rPr>
@@ -774,7 +761,7 @@
           </w:p>
           <w:p>
             <w:pPr>
-              <w:spacing w:before="0" w:after="0" w:line="250" w:lineRule="exact"/>
+              <w:spacing w:before="0" w:after="0" w:line="240" w:lineRule="exact"/>
             </w:pPr>
             <w:r>
               <w:rPr>
@@ -795,7 +782,7 @@
           </w:p>
           <w:p>
             <w:pPr>
-              <w:spacing w:before="100" w:after="0" w:line="260" w:lineRule="exact"/>
+              <w:spacing w:before="80" w:after="0" w:line="20" w:lineRule="exact"/>
             </w:pPr>
             <w:r>
               <w:rPr>
@@ -809,21 +796,23 @@
             <w:r>
               <w:rPr>
                 <w:rFonts w:ascii="Calibri" w:hAnsi="Calibri"/>
+                <w:b/>
                 <w:color w:val="22C55E"/>
                 <w:sz w:val="16"/>
               </w:rPr>
-              <w:t xml:space="preserve">    2022 – 2024</w:t>
+              <w:t xml:space="preserve">   2022 – 2024</w:t>
             </w:r>
           </w:p>
           <w:p>
             <w:pPr>
-              <w:spacing w:before="0" w:after="20" w:line="240" w:lineRule="exact"/>
+              <w:spacing w:before="0" w:after="0" w:line="240" w:lineRule="exact"/>
             </w:pPr>
             <w:r>
               <w:rPr>
                 <w:rFonts w:ascii="Calibri" w:hAnsi="Calibri"/>
+                <w:b w:val="0"/>
                 <w:i/>
-                <w:color w:val="888888"/>
+                <w:color w:val="555555"/>
                 <w:sz w:val="17"/>
               </w:rPr>
               <w:t>ePandu Sdn Bhd</w:t>
@@ -831,7 +820,7 @@
           </w:p>
           <w:p>
             <w:pPr>
-              <w:spacing w:before="0" w:after="0" w:line="250" w:lineRule="exact"/>
+              <w:spacing w:before="0" w:after="0" w:line="240" w:lineRule="exact"/>
             </w:pPr>
             <w:r>
               <w:rPr>
@@ -852,7 +841,7 @@
           </w:p>
           <w:p>
             <w:pPr>
-              <w:spacing w:before="0" w:after="0" w:line="250" w:lineRule="exact"/>
+              <w:spacing w:before="0" w:after="0" w:line="240" w:lineRule="exact"/>
             </w:pPr>
             <w:r>
               <w:rPr>
@@ -873,7 +862,7 @@
           </w:p>
           <w:p>
             <w:pPr>
-              <w:spacing w:before="100" w:after="0" w:line="260" w:lineRule="exact"/>
+              <w:spacing w:before="80" w:after="0" w:line="20" w:lineRule="exact"/>
             </w:pPr>
             <w:r>
               <w:rPr>
@@ -887,21 +876,23 @@
             <w:r>
               <w:rPr>
                 <w:rFonts w:ascii="Calibri" w:hAnsi="Calibri"/>
+                <w:b/>
                 <w:color w:val="22C55E"/>
                 <w:sz w:val="16"/>
               </w:rPr>
-              <w:t xml:space="preserve">    2021</w:t>
+              <w:t xml:space="preserve">   2021</w:t>
             </w:r>
           </w:p>
           <w:p>
             <w:pPr>
-              <w:spacing w:before="0" w:after="20" w:line="240" w:lineRule="exact"/>
+              <w:spacing w:before="0" w:after="0" w:line="240" w:lineRule="exact"/>
             </w:pPr>
             <w:r>
               <w:rPr>
                 <w:rFonts w:ascii="Calibri" w:hAnsi="Calibri"/>
+                <w:b w:val="0"/>
                 <w:i/>
-                <w:color w:val="888888"/>
+                <w:color w:val="555555"/>
                 <w:sz w:val="17"/>
               </w:rPr>
               <w:t>GAMA Supermarket &amp; Dept Store</w:t>
@@ -909,7 +900,7 @@
           </w:p>
           <w:p>
             <w:pPr>
-              <w:spacing w:before="0" w:after="0" w:line="250" w:lineRule="exact"/>
+              <w:spacing w:before="0" w:after="0" w:line="240" w:lineRule="exact"/>
             </w:pPr>
             <w:r>
               <w:rPr>
@@ -930,7 +921,7 @@
           </w:p>
           <w:p>
             <w:pPr>
-              <w:spacing w:before="0" w:after="0" w:line="250" w:lineRule="exact"/>
+              <w:spacing w:before="0" w:after="0" w:line="240" w:lineRule="exact"/>
             </w:pPr>
             <w:r>
               <w:rPr>
@@ -951,7 +942,7 @@
           </w:p>
           <w:p>
             <w:pPr>
-              <w:spacing w:before="100" w:after="0" w:line="260" w:lineRule="exact"/>
+              <w:spacing w:before="80" w:after="0" w:line="20" w:lineRule="exact"/>
             </w:pPr>
             <w:r>
               <w:rPr>
@@ -965,21 +956,23 @@
             <w:r>
               <w:rPr>
                 <w:rFonts w:ascii="Calibri" w:hAnsi="Calibri"/>
+                <w:b/>
                 <w:color w:val="22C55E"/>
                 <w:sz w:val="16"/>
               </w:rPr>
-              <w:t xml:space="preserve">    2019 – 2020</w:t>
+              <w:t xml:space="preserve">   2019 – 2020</w:t>
             </w:r>
           </w:p>
           <w:p>
             <w:pPr>
-              <w:spacing w:before="0" w:after="20" w:line="240" w:lineRule="exact"/>
+              <w:spacing w:before="0" w:after="0" w:line="240" w:lineRule="exact"/>
             </w:pPr>
             <w:r>
               <w:rPr>
                 <w:rFonts w:ascii="Calibri" w:hAnsi="Calibri"/>
+                <w:b w:val="0"/>
                 <w:i/>
-                <w:color w:val="888888"/>
+                <w:color w:val="555555"/>
                 <w:sz w:val="17"/>
               </w:rPr>
               <w:t>DISTED College</w:t>
@@ -987,7 +980,7 @@
           </w:p>
           <w:p>
             <w:pPr>
-              <w:spacing w:before="0" w:after="0" w:line="250" w:lineRule="exact"/>
+              <w:spacing w:before="0" w:after="0" w:line="240" w:lineRule="exact"/>
             </w:pPr>
             <w:r>
               <w:rPr>
@@ -1008,7 +1001,7 @@
           </w:p>
           <w:p>
             <w:pPr>
-              <w:spacing w:before="0" w:after="0" w:line="250" w:lineRule="exact"/>
+              <w:spacing w:before="0" w:after="0" w:line="240" w:lineRule="exact"/>
             </w:pPr>
             <w:r>
               <w:rPr>
@@ -1029,7 +1022,7 @@
           </w:p>
           <w:p>
             <w:pPr>
-              <w:spacing w:before="100" w:after="0" w:line="260" w:lineRule="exact"/>
+              <w:spacing w:before="80" w:after="0" w:line="20" w:lineRule="exact"/>
             </w:pPr>
             <w:r>
               <w:rPr>
@@ -1043,21 +1036,23 @@
             <w:r>
               <w:rPr>
                 <w:rFonts w:ascii="Calibri" w:hAnsi="Calibri"/>
+                <w:b/>
                 <w:color w:val="22C55E"/>
                 <w:sz w:val="16"/>
               </w:rPr>
-              <w:t xml:space="preserve">    2016 – 2018</w:t>
+              <w:t xml:space="preserve">   2016 – 2018</w:t>
             </w:r>
           </w:p>
           <w:p>
             <w:pPr>
-              <w:spacing w:before="0" w:after="20" w:line="240" w:lineRule="exact"/>
+              <w:spacing w:before="0" w:after="0" w:line="240" w:lineRule="exact"/>
             </w:pPr>
             <w:r>
               <w:rPr>
                 <w:rFonts w:ascii="Calibri" w:hAnsi="Calibri"/>
+                <w:b w:val="0"/>
                 <w:i/>
-                <w:color w:val="888888"/>
+                <w:color w:val="555555"/>
                 <w:sz w:val="17"/>
               </w:rPr>
               <w:t>GAMA Supermarket &amp; Dept Store</w:t>
@@ -1065,7 +1060,7 @@
           </w:p>
           <w:p>
             <w:pPr>
-              <w:spacing w:before="0" w:after="0" w:line="250" w:lineRule="exact"/>
+              <w:spacing w:before="0" w:after="0" w:line="240" w:lineRule="exact"/>
             </w:pPr>
             <w:r>
               <w:rPr>
@@ -1086,7 +1081,7 @@
           </w:p>
           <w:p>
             <w:pPr>
-              <w:spacing w:before="100" w:after="0" w:line="260" w:lineRule="exact"/>
+              <w:spacing w:before="80" w:after="0" w:line="20" w:lineRule="exact"/>
             </w:pPr>
             <w:r>
               <w:rPr>
@@ -1100,21 +1095,23 @@
             <w:r>
               <w:rPr>
                 <w:rFonts w:ascii="Calibri" w:hAnsi="Calibri"/>
+                <w:b/>
                 <w:color w:val="22C55E"/>
                 <w:sz w:val="16"/>
               </w:rPr>
-              <w:t xml:space="preserve">    2012 – 2015</w:t>
+              <w:t xml:space="preserve">   2012 – 2015</w:t>
             </w:r>
           </w:p>
           <w:p>
             <w:pPr>
-              <w:spacing w:before="0" w:after="20" w:line="240" w:lineRule="exact"/>
+              <w:spacing w:before="0" w:after="0" w:line="240" w:lineRule="exact"/>
             </w:pPr>
             <w:r>
               <w:rPr>
                 <w:rFonts w:ascii="Calibri" w:hAnsi="Calibri"/>
+                <w:b w:val="0"/>
                 <w:i/>
-                <w:color w:val="888888"/>
+                <w:color w:val="555555"/>
                 <w:sz w:val="17"/>
               </w:rPr>
               <w:t>UniKL Resources Sdn Bhd</w:t>
@@ -1122,7 +1119,7 @@
           </w:p>
           <w:p>
             <w:pPr>
-              <w:spacing w:before="0" w:after="0" w:line="250" w:lineRule="exact"/>
+              <w:spacing w:before="0" w:after="0" w:line="240" w:lineRule="exact"/>
             </w:pPr>
             <w:r>
               <w:rPr>
@@ -1143,7 +1140,7 @@
           </w:p>
           <w:p>
             <w:pPr>
-              <w:spacing w:before="0" w:after="0" w:line="250" w:lineRule="exact"/>
+              <w:spacing w:before="0" w:after="0" w:line="240" w:lineRule="exact"/>
             </w:pPr>
             <w:r>
               <w:rPr>
@@ -1164,7 +1161,7 @@
           </w:p>
           <w:p>
             <w:pPr>
-              <w:spacing w:before="160" w:after="60" w:line="280" w:lineRule="exact"/>
+              <w:spacing w:before="160" w:after="60" w:line="20" w:lineRule="exact"/>
               <w:pBdr>
                 <w:bottom w:val="single" w:sz="4" w:space="1" w:color="22C55E"/>
               </w:pBdr>
@@ -1181,12 +1178,13 @@
           </w:p>
           <w:p>
             <w:pPr>
-              <w:spacing w:before="60" w:after="0" w:line="240" w:lineRule="exact"/>
+              <w:spacing w:before="0" w:after="0" w:line="240" w:lineRule="exact"/>
             </w:pPr>
             <w:r>
               <w:rPr>
                 <w:rFonts w:ascii="Calibri" w:hAnsi="Calibri"/>
                 <w:b/>
+                <w:i w:val="0"/>
                 <w:color w:val="111111"/>
                 <w:sz w:val="17"/>
               </w:rPr>
@@ -1202,7 +1200,7 @@
                 <w:rFonts w:ascii="Calibri" w:hAnsi="Calibri"/>
                 <w:b w:val="0"/>
                 <w:i w:val="0"/>
-                <w:color w:val="888888"/>
+                <w:color w:val="555555"/>
                 <w:sz w:val="16"/>
               </w:rPr>
               <w:t>Full-scale ERP replacing SAP/Navision. SCM, finance, HR, procurement, refinery ops.</w:t>
@@ -1225,12 +1223,13 @@
           </w:p>
           <w:p>
             <w:pPr>
-              <w:spacing w:before="60" w:after="0" w:line="240" w:lineRule="exact"/>
+              <w:spacing w:before="0" w:after="0" w:line="240" w:lineRule="exact"/>
             </w:pPr>
             <w:r>
               <w:rPr>
                 <w:rFonts w:ascii="Calibri" w:hAnsi="Calibri"/>
                 <w:b/>
+                <w:i w:val="0"/>
                 <w:color w:val="111111"/>
                 <w:sz w:val="17"/>
               </w:rPr>
@@ -1246,7 +1245,7 @@
                 <w:rFonts w:ascii="Calibri" w:hAnsi="Calibri"/>
                 <w:b w:val="0"/>
                 <w:i w:val="0"/>
-                <w:color w:val="888888"/>
+                <w:color w:val="555555"/>
                 <w:sz w:val="16"/>
               </w:rPr>
               <w:t>ML-powered forex prediction generating calibrated BUY/SELL probabilities from historical data.</w:t>
@@ -1269,12 +1268,13 @@
           </w:p>
           <w:p>
             <w:pPr>
-              <w:spacing w:before="60" w:after="0" w:line="240" w:lineRule="exact"/>
+              <w:spacing w:before="0" w:after="0" w:line="240" w:lineRule="exact"/>
             </w:pPr>
             <w:r>
               <w:rPr>
                 <w:rFonts w:ascii="Calibri" w:hAnsi="Calibri"/>
                 <w:b/>
+                <w:i w:val="0"/>
                 <w:color w:val="111111"/>
                 <w:sz w:val="17"/>
               </w:rPr>
@@ -1290,7 +1290,7 @@
                 <w:rFonts w:ascii="Calibri" w:hAnsi="Calibri"/>
                 <w:b w:val="0"/>
                 <w:i w:val="0"/>
-                <w:color w:val="888888"/>
+                <w:color w:val="555555"/>
                 <w:sz w:val="16"/>
               </w:rPr>
               <w:t>Platform for managing teams and projects with proper engineering standards.</w:t>
@@ -1313,12 +1313,13 @@
           </w:p>
           <w:p>
             <w:pPr>
-              <w:spacing w:before="60" w:after="0" w:line="240" w:lineRule="exact"/>
+              <w:spacing w:before="0" w:after="0" w:line="240" w:lineRule="exact"/>
             </w:pPr>
             <w:r>
               <w:rPr>
                 <w:rFonts w:ascii="Calibri" w:hAnsi="Calibri"/>
                 <w:b/>
+                <w:i w:val="0"/>
                 <w:color w:val="111111"/>
                 <w:sz w:val="17"/>
               </w:rPr>
@@ -1334,7 +1335,7 @@
                 <w:rFonts w:ascii="Calibri" w:hAnsi="Calibri"/>
                 <w:b w:val="0"/>
                 <w:i w:val="0"/>
-                <w:color w:val="888888"/>
+                <w:color w:val="555555"/>
                 <w:sz w:val="16"/>
               </w:rPr>
               <w:t>AI system processing 125,000+ documents with semantic search, knowledge graphs, and automated ingestion.</w:t>
@@ -1357,7 +1358,7 @@
           </w:p>
           <w:p>
             <w:pPr>
-              <w:spacing w:before="160" w:after="60" w:line="280" w:lineRule="exact"/>
+              <w:spacing w:before="160" w:after="60" w:line="20" w:lineRule="exact"/>
               <w:pBdr>
                 <w:bottom w:val="single" w:sz="4" w:space="1" w:color="22C55E"/>
               </w:pBdr>
@@ -1374,7 +1375,7 @@
           </w:p>
           <w:p>
             <w:pPr>
-              <w:spacing w:before="40" w:after="80" w:line="260" w:lineRule="exact"/>
+              <w:spacing w:before="0" w:after="120" w:line="260" w:lineRule="exact"/>
             </w:pPr>
             <w:r>
               <w:rPr>

</xml_diff>

<commit_message>
fix: regenerate PDF and DOCX after EOIOT removal
</commit_message>
<xml_diff>
--- a/Mohamad_Firdaus_Resume_2026.docx
+++ b/Mohamad_Firdaus_Resume_2026.docx
@@ -2,1405 +2,259 @@
 <file path=word/document.xml><?xml version="1.0" encoding="utf-8"?>
 <w:document xmlns:wpc="http://schemas.microsoft.com/office/word/2010/wordprocessingCanvas" xmlns:mo="http://schemas.microsoft.com/office/mac/office/2008/main" xmlns:mc="http://schemas.openxmlformats.org/markup-compatibility/2006" xmlns:mv="urn:schemas-microsoft-com:mac:vml" xmlns:o="urn:schemas-microsoft-com:office:office" xmlns:r="http://schemas.openxmlformats.org/officeDocument/2006/relationships" xmlns:m="http://schemas.openxmlformats.org/officeDocument/2006/math" xmlns:v="urn:schemas-microsoft-com:vml" xmlns:wp14="http://schemas.microsoft.com/office/word/2010/wordprocessingDrawing" xmlns:wp="http://schemas.openxmlformats.org/drawingml/2006/wordprocessingDrawing" xmlns:w10="urn:schemas-microsoft-com:office:word" xmlns:w="http://schemas.openxmlformats.org/wordprocessingml/2006/main" xmlns:w14="http://schemas.microsoft.com/office/word/2010/wordml" xmlns:wpg="http://schemas.microsoft.com/office/word/2010/wordprocessingGroup" xmlns:wpi="http://schemas.microsoft.com/office/word/2010/wordprocessingInk" xmlns:wne="http://schemas.microsoft.com/office/word/2006/wordml" xmlns:wps="http://schemas.microsoft.com/office/word/2010/wordprocessingShape" mc:Ignorable="w14 wp14">
   <w:body>
-    <w:tbl>
-      <w:tblGrid>
-        <w:gridCol w:w="4000"/>
-        <w:gridCol w:w="13000"/>
-      </w:tblGrid>
-      <w:tblPr>
-        <w:tblW w:type="auto" w:w="0"/>
-        <w:jc w:val="center"/>
-        <w:tblLook w:firstColumn="1" w:firstRow="1" w:lastColumn="0" w:lastRow="0" w:noHBand="0" w:noVBand="1" w:val="04A0"/>
-        <w:tblW w:w="17000" w:type="dxa"/>
-      </w:tblPr>
-      <w:tblGrid>
-        <w:gridCol w:w="4680"/>
-        <w:gridCol w:w="4680"/>
-      </w:tblGrid>
-      <w:tr>
-        <w:tc>
-          <w:tcPr>
-            <w:tcW w:type="dxa" w:w="4680"/>
-            <w:shd w:fill="1a1a2e" w:val="clear"/>
-            <w:tcMar>
-              <w:top w:w="60" w:type="dxa"/>
-              <w:left w:w="80" w:type="dxa"/>
-              <w:bottom w:w="60" w:type="dxa"/>
-              <w:right w:w="80" w:type="dxa"/>
-            </w:tcMar>
-          </w:tcPr>
-          <w:p/>
-          <w:p>
-            <w:pPr>
-              <w:spacing w:before="0" w:after="0" w:line="220" w:lineRule="exact"/>
-            </w:pPr>
-            <w:r>
-              <w:rPr>
-                <w:rFonts w:ascii="Calibri" w:hAnsi="Calibri"/>
-                <w:b w:val="0"/>
-                <w:color w:val="BBBBBB"/>
-                <w:sz w:val="8"/>
-              </w:rPr>
-            </w:r>
-          </w:p>
-          <w:p>
-            <w:pPr>
-              <w:spacing w:before="200" w:after="60" w:line="20" w:lineRule="exact"/>
-              <w:pBdr>
-                <w:bottom w:val="single" w:sz="4" w:space="1" w:color="22C55E"/>
-              </w:pBdr>
-            </w:pPr>
-            <w:r>
-              <w:rPr>
-                <w:rFonts w:ascii="Calibri" w:hAnsi="Calibri"/>
-                <w:b/>
-                <w:color w:val="22C55E"/>
-                <w:sz w:val="15"/>
-              </w:rPr>
-              <w:t>CONTACT</w:t>
-            </w:r>
-          </w:p>
-          <w:p>
-            <w:pPr>
-              <w:spacing w:before="0" w:after="0" w:line="220" w:lineRule="exact"/>
-            </w:pPr>
-            <w:r>
-              <w:rPr>
-                <w:rFonts w:ascii="Calibri" w:hAnsi="Calibri"/>
-                <w:b w:val="0"/>
-                <w:color w:val="BBBBBB"/>
-                <w:sz w:val="14"/>
-              </w:rPr>
-              <w:t>014-3043514</w:t>
-            </w:r>
-          </w:p>
-          <w:p>
-            <w:pPr>
-              <w:spacing w:before="0" w:after="0" w:line="220" w:lineRule="exact"/>
-            </w:pPr>
-            <w:r>
-              <w:rPr>
-                <w:rFonts w:ascii="Calibri" w:hAnsi="Calibri"/>
-                <w:b w:val="0"/>
-                <w:color w:val="BBBBBB"/>
-                <w:sz w:val="14"/>
-              </w:rPr>
-              <w:t>fdfrontdev@gmail.com</w:t>
-            </w:r>
-          </w:p>
-          <w:p>
-            <w:pPr>
-              <w:spacing w:before="0" w:after="0" w:line="220" w:lineRule="exact"/>
-            </w:pPr>
-            <w:r>
-              <w:rPr>
-                <w:rFonts w:ascii="Calibri" w:hAnsi="Calibri"/>
-                <w:b w:val="0"/>
-                <w:color w:val="BBBBBB"/>
-                <w:sz w:val="14"/>
-              </w:rPr>
-              <w:t>Balik Pulau, Penang</w:t>
-            </w:r>
-          </w:p>
-          <w:p>
-            <w:pPr>
-              <w:spacing w:before="0" w:after="0" w:line="220" w:lineRule="exact"/>
-            </w:pPr>
-            <w:r>
-              <w:rPr>
-                <w:rFonts w:ascii="Calibri" w:hAnsi="Calibri"/>
-                <w:b w:val="0"/>
-                <w:color w:val="BBBBBB"/>
-                <w:sz w:val="14"/>
-              </w:rPr>
-              <w:t>linkedin.com/in/fdfrontdev</w:t>
-            </w:r>
-          </w:p>
-          <w:p>
-            <w:pPr>
-              <w:spacing w:before="0" w:after="0" w:line="220" w:lineRule="exact"/>
-            </w:pPr>
-            <w:r>
-              <w:rPr>
-                <w:rFonts w:ascii="Calibri" w:hAnsi="Calibri"/>
-                <w:b w:val="0"/>
-                <w:color w:val="BBBBBB"/>
-                <w:sz w:val="14"/>
-              </w:rPr>
-              <w:t>github.com/fdfrontdev</w:t>
-            </w:r>
-          </w:p>
-          <w:p>
-            <w:pPr>
-              <w:spacing w:before="0" w:after="0" w:line="220" w:lineRule="exact"/>
-            </w:pPr>
-            <w:r>
-              <w:rPr>
-                <w:rFonts w:ascii="Calibri" w:hAnsi="Calibri"/>
-                <w:b w:val="0"/>
-                <w:color w:val="BBBBBB"/>
-                <w:sz w:val="14"/>
-              </w:rPr>
-              <w:t>fdfrontdev.github.io/web-profile-deploy</w:t>
-            </w:r>
-          </w:p>
-          <w:p>
-            <w:pPr>
-              <w:spacing w:before="200" w:after="60" w:line="20" w:lineRule="exact"/>
-              <w:pBdr>
-                <w:bottom w:val="single" w:sz="4" w:space="1" w:color="22C55E"/>
-              </w:pBdr>
-            </w:pPr>
-            <w:r>
-              <w:rPr>
-                <w:rFonts w:ascii="Calibri" w:hAnsi="Calibri"/>
-                <w:b/>
-                <w:color w:val="22C55E"/>
-                <w:sz w:val="15"/>
-              </w:rPr>
-              <w:t>SKILLS</w:t>
-            </w:r>
-          </w:p>
-          <w:p>
-            <w:pPr>
-              <w:spacing w:before="0" w:after="0" w:line="200" w:lineRule="exact"/>
-            </w:pPr>
-            <w:r>
-              <w:rPr>
-                <w:rFonts w:ascii="Calibri" w:hAnsi="Calibri"/>
-                <w:color w:val="4ADE80"/>
-                <w:sz w:val="13"/>
-              </w:rPr>
-              <w:t>ERP Architecture</w:t>
-            </w:r>
-          </w:p>
-          <w:p>
-            <w:pPr>
-              <w:spacing w:before="0" w:after="0" w:line="200" w:lineRule="exact"/>
-            </w:pPr>
-            <w:r>
-              <w:rPr>
-                <w:rFonts w:ascii="Calibri" w:hAnsi="Calibri"/>
-                <w:color w:val="4ADE80"/>
-                <w:sz w:val="13"/>
-              </w:rPr>
-              <w:t>Full-Stack Dev</w:t>
-            </w:r>
-          </w:p>
-          <w:p>
-            <w:pPr>
-              <w:spacing w:before="0" w:after="0" w:line="200" w:lineRule="exact"/>
-            </w:pPr>
-            <w:r>
-              <w:rPr>
-                <w:rFonts w:ascii="Calibri" w:hAnsi="Calibri"/>
-                <w:color w:val="4ADE80"/>
-                <w:sz w:val="13"/>
-              </w:rPr>
-              <w:t>AI/ML Integration</w:t>
-            </w:r>
-          </w:p>
-          <w:p>
-            <w:pPr>
-              <w:spacing w:before="0" w:after="0" w:line="200" w:lineRule="exact"/>
-            </w:pPr>
-            <w:r>
-              <w:rPr>
-                <w:rFonts w:ascii="Calibri" w:hAnsi="Calibri"/>
-                <w:color w:val="4ADE80"/>
-                <w:sz w:val="13"/>
-              </w:rPr>
-              <w:t>System Design</w:t>
-            </w:r>
-          </w:p>
-          <w:p>
-            <w:pPr>
-              <w:spacing w:before="0" w:after="0" w:line="200" w:lineRule="exact"/>
-            </w:pPr>
-            <w:r>
-              <w:rPr>
-                <w:rFonts w:ascii="Calibri" w:hAnsi="Calibri"/>
-                <w:color w:val="4ADE80"/>
-                <w:sz w:val="13"/>
-              </w:rPr>
-              <w:t>Team Leadership</w:t>
-            </w:r>
-          </w:p>
-          <w:p>
-            <w:pPr>
-              <w:spacing w:before="0" w:after="0" w:line="200" w:lineRule="exact"/>
-            </w:pPr>
-            <w:r>
-              <w:rPr>
-                <w:rFonts w:ascii="Calibri" w:hAnsi="Calibri"/>
-                <w:color w:val="4ADE80"/>
-                <w:sz w:val="13"/>
-              </w:rPr>
-              <w:t>Python</w:t>
-            </w:r>
-          </w:p>
-          <w:p>
-            <w:pPr>
-              <w:spacing w:before="0" w:after="0" w:line="200" w:lineRule="exact"/>
-            </w:pPr>
-            <w:r>
-              <w:rPr>
-                <w:rFonts w:ascii="Calibri" w:hAnsi="Calibri"/>
-                <w:color w:val="4ADE80"/>
-                <w:sz w:val="13"/>
-              </w:rPr>
-              <w:t>TypeScript</w:t>
-            </w:r>
-          </w:p>
-          <w:p>
-            <w:pPr>
-              <w:spacing w:before="0" w:after="0" w:line="200" w:lineRule="exact"/>
-            </w:pPr>
-            <w:r>
-              <w:rPr>
-                <w:rFonts w:ascii="Calibri" w:hAnsi="Calibri"/>
-                <w:color w:val="4ADE80"/>
-                <w:sz w:val="13"/>
-              </w:rPr>
-              <w:t>Nuxt / Vue</w:t>
-            </w:r>
-          </w:p>
-          <w:p>
-            <w:pPr>
-              <w:spacing w:before="0" w:after="0" w:line="200" w:lineRule="exact"/>
-            </w:pPr>
-            <w:r>
-              <w:rPr>
-                <w:rFonts w:ascii="Calibri" w:hAnsi="Calibri"/>
-                <w:color w:val="4ADE80"/>
-                <w:sz w:val="13"/>
-              </w:rPr>
-              <w:t>Vuetify</w:t>
-            </w:r>
-          </w:p>
-          <w:p>
-            <w:pPr>
-              <w:spacing w:before="0" w:after="0" w:line="200" w:lineRule="exact"/>
-            </w:pPr>
-            <w:r>
-              <w:rPr>
-                <w:rFonts w:ascii="Calibri" w:hAnsi="Calibri"/>
-                <w:color w:val="4ADE80"/>
-                <w:sz w:val="13"/>
-              </w:rPr>
-              <w:t>Prisma</w:t>
-            </w:r>
-          </w:p>
-          <w:p>
-            <w:pPr>
-              <w:spacing w:before="0" w:after="0" w:line="200" w:lineRule="exact"/>
-            </w:pPr>
-            <w:r>
-              <w:rPr>
-                <w:rFonts w:ascii="Calibri" w:hAnsi="Calibri"/>
-                <w:color w:val="4ADE80"/>
-                <w:sz w:val="13"/>
-              </w:rPr>
-              <w:t>PostgreSQL</w:t>
-            </w:r>
-          </w:p>
-          <w:p>
-            <w:pPr>
-              <w:spacing w:before="0" w:after="0" w:line="200" w:lineRule="exact"/>
-            </w:pPr>
-            <w:r>
-              <w:rPr>
-                <w:rFonts w:ascii="Calibri" w:hAnsi="Calibri"/>
-                <w:color w:val="4ADE80"/>
-                <w:sz w:val="13"/>
-              </w:rPr>
-              <w:t>FastAPI</w:t>
-            </w:r>
-          </w:p>
-          <w:p>
-            <w:pPr>
-              <w:spacing w:before="0" w:after="0" w:line="200" w:lineRule="exact"/>
-            </w:pPr>
-            <w:r>
-              <w:rPr>
-                <w:rFonts w:ascii="Calibri" w:hAnsi="Calibri"/>
-                <w:color w:val="4ADE80"/>
-                <w:sz w:val="13"/>
-              </w:rPr>
-              <w:t>Scikit-Learn</w:t>
-            </w:r>
-          </w:p>
-          <w:p>
-            <w:pPr>
-              <w:spacing w:before="0" w:after="0" w:line="200" w:lineRule="exact"/>
-            </w:pPr>
-            <w:r>
-              <w:rPr>
-                <w:rFonts w:ascii="Calibri" w:hAnsi="Calibri"/>
-                <w:color w:val="4ADE80"/>
-                <w:sz w:val="13"/>
-              </w:rPr>
-              <w:t>Git / CI/CD</w:t>
-            </w:r>
-          </w:p>
-          <w:p>
-            <w:pPr>
-              <w:spacing w:before="200" w:after="60" w:line="20" w:lineRule="exact"/>
-              <w:pBdr>
-                <w:bottom w:val="single" w:sz="4" w:space="1" w:color="22C55E"/>
-              </w:pBdr>
-            </w:pPr>
-            <w:r>
-              <w:rPr>
-                <w:rFonts w:ascii="Calibri" w:hAnsi="Calibri"/>
-                <w:b/>
-                <w:color w:val="22C55E"/>
-                <w:sz w:val="15"/>
-              </w:rPr>
-              <w:t>EDUCATION</w:t>
-            </w:r>
-          </w:p>
-          <w:p>
-            <w:pPr>
-              <w:spacing w:before="0" w:after="0" w:line="220" w:lineRule="exact"/>
-            </w:pPr>
-            <w:r>
-              <w:rPr>
-                <w:rFonts w:ascii="Calibri" w:hAnsi="Calibri"/>
-                <w:b/>
-                <w:color w:val="BBBBBB"/>
-                <w:sz w:val="15"/>
-              </w:rPr>
-              <w:t>UniKL MIIT</w:t>
-            </w:r>
-          </w:p>
-          <w:p>
-            <w:pPr>
-              <w:spacing w:before="0" w:after="0" w:line="210" w:lineRule="exact"/>
-            </w:pPr>
-            <w:r>
-              <w:rPr>
-                <w:rFonts w:ascii="Calibri" w:hAnsi="Calibri"/>
-                <w:color w:val="BBBBBB"/>
-                <w:sz w:val="13"/>
-              </w:rPr>
-              <w:t>- B.Comp (Hons) Entrepreneurial Mgmt</w:t>
-            </w:r>
-          </w:p>
-          <w:p>
-            <w:pPr>
-              <w:spacing w:before="0" w:after="0" w:line="210" w:lineRule="exact"/>
-            </w:pPr>
-            <w:r>
-              <w:rPr>
-                <w:rFonts w:ascii="Calibri" w:hAnsi="Calibri"/>
-                <w:color w:val="BBBBBB"/>
-                <w:sz w:val="13"/>
-              </w:rPr>
-              <w:t>- CGPA 3.30 | Deans List 2x</w:t>
-            </w:r>
-          </w:p>
-          <w:p>
-            <w:pPr>
-              <w:spacing w:before="0" w:after="0" w:line="210" w:lineRule="exact"/>
-            </w:pPr>
-            <w:r>
-              <w:rPr>
-                <w:rFonts w:ascii="Calibri" w:hAnsi="Calibri"/>
-                <w:color w:val="BBBBBB"/>
-                <w:sz w:val="13"/>
-              </w:rPr>
-              <w:t>- Exchange: Yonsei Univ. S.Korea</w:t>
-            </w:r>
-          </w:p>
-          <w:p>
-            <w:pPr>
-              <w:spacing w:before="0" w:after="0" w:line="210" w:lineRule="exact"/>
-            </w:pPr>
-            <w:r>
-              <w:rPr>
-                <w:rFonts w:ascii="Calibri" w:hAnsi="Calibri"/>
-                <w:color w:val="BBBBBB"/>
-                <w:sz w:val="13"/>
-              </w:rPr>
-              <w:t>- Best Final Year Project 2012</w:t>
-            </w:r>
-          </w:p>
-          <w:p>
-            <w:pPr>
-              <w:spacing w:before="200" w:after="60" w:line="20" w:lineRule="exact"/>
-              <w:pBdr>
-                <w:bottom w:val="single" w:sz="4" w:space="1" w:color="22C55E"/>
-              </w:pBdr>
-            </w:pPr>
-            <w:r>
-              <w:rPr>
-                <w:rFonts w:ascii="Calibri" w:hAnsi="Calibri"/>
-                <w:b/>
-                <w:color w:val="22C55E"/>
-                <w:sz w:val="15"/>
-              </w:rPr>
-              <w:t>HIGHLIGHTS</w:t>
-            </w:r>
-          </w:p>
-          <w:p>
-            <w:pPr>
-              <w:spacing w:before="0" w:after="0" w:line="210" w:lineRule="exact"/>
-            </w:pPr>
-            <w:r>
-              <w:rPr>
-                <w:rFonts w:ascii="Calibri" w:hAnsi="Calibri"/>
-                <w:color w:val="BBBBBB"/>
-                <w:sz w:val="13"/>
-              </w:rPr>
-              <w:t>- Built ERP replacing SAP</w:t>
-            </w:r>
-          </w:p>
-          <w:p>
-            <w:pPr>
-              <w:spacing w:before="0" w:after="0" w:line="210" w:lineRule="exact"/>
-            </w:pPr>
-            <w:r>
-              <w:rPr>
-                <w:rFonts w:ascii="Calibri" w:hAnsi="Calibri"/>
-                <w:color w:val="BBBBBB"/>
-                <w:sz w:val="13"/>
-              </w:rPr>
-              <w:t>- 4 production systems from scratch</w:t>
-            </w:r>
-          </w:p>
-          <w:p>
-            <w:pPr>
-              <w:spacing w:before="0" w:after="0" w:line="210" w:lineRule="exact"/>
-            </w:pPr>
-            <w:r>
-              <w:rPr>
-                <w:rFonts w:ascii="Calibri" w:hAnsi="Calibri"/>
-                <w:color w:val="BBBBBB"/>
-                <w:sz w:val="13"/>
-              </w:rPr>
-              <w:t>- Led team as pioneer employee</w:t>
-            </w:r>
-          </w:p>
-          <w:p>
-            <w:pPr>
-              <w:spacing w:before="0" w:after="0" w:line="210" w:lineRule="exact"/>
-            </w:pPr>
-            <w:r>
-              <w:rPr>
-                <w:rFonts w:ascii="Calibri" w:hAnsi="Calibri"/>
-                <w:color w:val="BBBBBB"/>
-                <w:sz w:val="13"/>
-              </w:rPr>
-              <w:t>- Best FYP award 2012</w:t>
-            </w:r>
-          </w:p>
-          <w:p>
-            <w:pPr>
-              <w:spacing w:before="200" w:after="60" w:line="20" w:lineRule="exact"/>
-              <w:pBdr>
-                <w:bottom w:val="single" w:sz="4" w:space="1" w:color="22C55E"/>
-              </w:pBdr>
-            </w:pPr>
-            <w:r>
-              <w:rPr>
-                <w:rFonts w:ascii="Calibri" w:hAnsi="Calibri"/>
-                <w:b/>
-                <w:color w:val="22C55E"/>
-                <w:sz w:val="15"/>
-              </w:rPr>
-              <w:t>LANGUAGES</w:t>
-            </w:r>
-          </w:p>
-          <w:p>
-            <w:pPr>
-              <w:spacing w:before="0" w:after="0" w:line="220" w:lineRule="exact"/>
-            </w:pPr>
-            <w:r>
-              <w:rPr>
-                <w:rFonts w:ascii="Calibri" w:hAnsi="Calibri"/>
-                <w:b w:val="0"/>
-                <w:color w:val="BBBBBB"/>
-                <w:sz w:val="13"/>
-              </w:rPr>
-              <w:t>Malay (Native)</w:t>
-            </w:r>
-          </w:p>
-          <w:p>
-            <w:pPr>
-              <w:spacing w:before="0" w:after="0" w:line="220" w:lineRule="exact"/>
-            </w:pPr>
-            <w:r>
-              <w:rPr>
-                <w:rFonts w:ascii="Calibri" w:hAnsi="Calibri"/>
-                <w:b w:val="0"/>
-                <w:color w:val="BBBBBB"/>
-                <w:sz w:val="13"/>
-              </w:rPr>
-              <w:t>English (Professional)</w:t>
-            </w:r>
-          </w:p>
-        </w:tc>
-        <w:tc>
-          <w:tcPr>
-            <w:tcW w:type="dxa" w:w="4680"/>
-          </w:tcPr>
-          <w:p/>
-          <w:p>
-            <w:pPr>
-              <w:spacing w:before="0" w:after="0" w:line="260" w:lineRule="exact"/>
-            </w:pPr>
-            <w:r>
-              <w:rPr>
-                <w:rFonts w:ascii="Calibri" w:hAnsi="Calibri"/>
-                <w:b w:val="0"/>
-                <w:i w:val="0"/>
-                <w:color w:val="333333"/>
-                <w:sz w:val="8"/>
-              </w:rPr>
-            </w:r>
-          </w:p>
-          <w:p>
-            <w:pPr>
-              <w:spacing w:before="0" w:after="0" w:line="20" w:lineRule="exact"/>
-            </w:pPr>
-            <w:r>
-              <w:rPr>
-                <w:rFonts w:ascii="Calibri" w:hAnsi="Calibri"/>
-                <w:b/>
-                <w:color w:val="111111"/>
-                <w:sz w:val="40"/>
-              </w:rPr>
-              <w:t>MOHAMAD FIRDAUS</w:t>
-            </w:r>
-          </w:p>
-          <w:p>
-            <w:pPr>
-              <w:spacing w:before="0" w:after="0" w:line="20" w:lineRule="exact"/>
-            </w:pPr>
-            <w:r>
-              <w:rPr>
-                <w:rFonts w:ascii="Calibri" w:hAnsi="Calibri"/>
-                <w:b/>
-                <w:color w:val="22C55E"/>
-                <w:sz w:val="19"/>
-              </w:rPr>
-              <w:t>Built an ERP that replaced SAP, from scratch.</w:t>
-            </w:r>
-          </w:p>
-          <w:p>
-            <w:pPr>
-              <w:spacing w:before="0" w:after="0" w:line="20" w:lineRule="exact"/>
-            </w:pPr>
-            <w:r>
-              <w:rPr>
-                <w:rFonts w:ascii="Calibri" w:hAnsi="Calibri"/>
-                <w:color w:val="888888"/>
-                <w:sz w:val="16"/>
-              </w:rPr>
-              <w:t>Senior Software Engineer  ·  15+ Years  ·  Full-Stack  ·  AI/ML  ·  Balik Pulau, Penang</w:t>
-            </w:r>
-          </w:p>
-          <w:p>
-            <w:pPr>
-              <w:spacing w:before="80" w:after="80" w:line="20" w:lineRule="exact"/>
-              <w:pBdr>
-                <w:bottom w:val="single" w:sz="8" w:space="1" w:color="22C55E"/>
-              </w:pBdr>
-            </w:pPr>
-          </w:p>
-          <w:p>
-            <w:pPr>
-              <w:spacing w:before="160" w:after="60" w:line="20" w:lineRule="exact"/>
-              <w:pBdr>
-                <w:bottom w:val="single" w:sz="4" w:space="1" w:color="22C55E"/>
-              </w:pBdr>
-            </w:pPr>
-            <w:r>
-              <w:rPr>
-                <w:rFonts w:ascii="Calibri" w:hAnsi="Calibri"/>
-                <w:b/>
-                <w:color w:val="22C55E"/>
-                <w:sz w:val="18"/>
-              </w:rPr>
-              <w:t>WHO I AM</w:t>
-            </w:r>
-          </w:p>
-          <w:p>
-            <w:pPr>
-              <w:spacing w:before="0" w:after="0" w:line="260" w:lineRule="exact"/>
-            </w:pPr>
-            <w:r>
-              <w:rPr>
-                <w:rFonts w:ascii="Calibri" w:hAnsi="Calibri"/>
-                <w:b w:val="0"/>
-                <w:i w:val="0"/>
-                <w:color w:val="166534"/>
-                <w:sz w:val="17"/>
-              </w:rPr>
-              <w:t>Self-taught engineer who built a complete ERP replacing SAP/Navision for the palm oil industry. 15+ years across finance, retail, education, recruitment tech, and palm oil. I build systems that solve real business problems — not prototypes, not toys.</w:t>
-            </w:r>
-          </w:p>
-          <w:p>
-            <w:pPr>
-              <w:spacing w:before="160" w:after="60" w:line="20" w:lineRule="exact"/>
-              <w:pBdr>
-                <w:bottom w:val="single" w:sz="4" w:space="1" w:color="22C55E"/>
-              </w:pBdr>
-            </w:pPr>
-            <w:r>
-              <w:rPr>
-                <w:rFonts w:ascii="Calibri" w:hAnsi="Calibri"/>
-                <w:b/>
-                <w:color w:val="22C55E"/>
-                <w:sz w:val="18"/>
-              </w:rPr>
-              <w:t>EXPERIENCE</w:t>
-            </w:r>
-          </w:p>
-          <w:p>
-            <w:pPr>
-              <w:spacing w:before="80" w:after="0" w:line="20" w:lineRule="exact"/>
-            </w:pPr>
-            <w:r>
-              <w:rPr>
-                <w:rFonts w:ascii="Calibri" w:hAnsi="Calibri"/>
-                <w:b/>
-                <w:color w:val="111111"/>
-                <w:sz w:val="19"/>
-              </w:rPr>
-              <w:t>Senior Software Engineer / Head of Software</w:t>
-            </w:r>
-            <w:r>
-              <w:rPr>
-                <w:rFonts w:ascii="Calibri" w:hAnsi="Calibri"/>
-                <w:b/>
-                <w:color w:val="22C55E"/>
-                <w:sz w:val="16"/>
-              </w:rPr>
-              <w:t xml:space="preserve">   2024 – Present</w:t>
-            </w:r>
-          </w:p>
-          <w:p>
-            <w:pPr>
-              <w:spacing w:before="0" w:after="0" w:line="240" w:lineRule="exact"/>
-            </w:pPr>
-            <w:r>
-              <w:rPr>
-                <w:rFonts w:ascii="Calibri" w:hAnsi="Calibri"/>
-                <w:b w:val="0"/>
-                <w:i/>
-                <w:color w:val="555555"/>
-                <w:sz w:val="17"/>
-              </w:rPr>
-              <w:t>GlobalIoT Sdn Bhd</w:t>
-            </w:r>
-          </w:p>
-          <w:p>
-            <w:pPr>
-              <w:spacing w:before="0" w:after="0" w:line="240" w:lineRule="exact"/>
-            </w:pPr>
-            <w:r>
-              <w:rPr>
-                <w:rFonts w:ascii="Calibri" w:hAnsi="Calibri"/>
-                <w:color w:val="22C55E"/>
-                <w:sz w:val="16"/>
-              </w:rPr>
-              <w:t xml:space="preserve">  •  </w:t>
-            </w:r>
-            <w:r>
-              <w:rPr>
-                <w:rFonts w:ascii="Calibri" w:hAnsi="Calibri"/>
-                <w:color w:val="333333"/>
-                <w:sz w:val="16"/>
-              </w:rPr>
-              <w:t>Architected and built EOIOT — a full ERP replacing SAP/Navision for palm oil refinery operations (supply chain, finance, HR, procurement, operations)</w:t>
-            </w:r>
-          </w:p>
-          <w:p>
-            <w:pPr>
-              <w:spacing w:before="0" w:after="0" w:line="240" w:lineRule="exact"/>
-            </w:pPr>
-            <w:r>
-              <w:rPr>
-                <w:rFonts w:ascii="Calibri" w:hAnsi="Calibri"/>
-                <w:color w:val="22C55E"/>
-                <w:sz w:val="16"/>
-              </w:rPr>
-              <w:t xml:space="preserve">  •  </w:t>
-            </w:r>
-            <w:r>
-              <w:rPr>
-                <w:rFonts w:ascii="Calibri" w:hAnsi="Calibri"/>
-                <w:color w:val="333333"/>
-                <w:sz w:val="16"/>
-              </w:rPr>
-              <w:t>Led a team of engineers, established code review, CI/CD, and development standards</w:t>
-            </w:r>
-          </w:p>
-          <w:p>
-            <w:pPr>
-              <w:spacing w:before="0" w:after="0" w:line="240" w:lineRule="exact"/>
-            </w:pPr>
-            <w:r>
-              <w:rPr>
-                <w:rFonts w:ascii="Calibri" w:hAnsi="Calibri"/>
-                <w:color w:val="22C55E"/>
-                <w:sz w:val="16"/>
-              </w:rPr>
-              <w:t xml:space="preserve">  •  </w:t>
-            </w:r>
-            <w:r>
-              <w:rPr>
-                <w:rFonts w:ascii="Calibri" w:hAnsi="Calibri"/>
-                <w:color w:val="333333"/>
-                <w:sz w:val="16"/>
-              </w:rPr>
-              <w:t>Wore 7 hats: BA, PM, Architect, Developer, QA, Support Lead, Mentor</w:t>
-            </w:r>
-          </w:p>
-          <w:p>
-            <w:pPr>
-              <w:spacing w:before="0" w:after="0" w:line="240" w:lineRule="exact"/>
-            </w:pPr>
-            <w:r>
-              <w:rPr>
-                <w:rFonts w:ascii="Calibri" w:hAnsi="Calibri"/>
-                <w:color w:val="22C55E"/>
-                <w:sz w:val="16"/>
-              </w:rPr>
-              <w:t xml:space="preserve">  •  </w:t>
-            </w:r>
-            <w:r>
-              <w:rPr>
-                <w:rFonts w:ascii="Calibri" w:hAnsi="Calibri"/>
-                <w:color w:val="333333"/>
-                <w:sz w:val="16"/>
-              </w:rPr>
-              <w:t>Served a government-linked client (Sawit Kinabalu / Kunak Refinery)</w:t>
-            </w:r>
-          </w:p>
-          <w:p>
-            <w:pPr>
-              <w:spacing w:before="80" w:after="0" w:line="20" w:lineRule="exact"/>
-            </w:pPr>
-            <w:r>
-              <w:rPr>
-                <w:rFonts w:ascii="Calibri" w:hAnsi="Calibri"/>
-                <w:b/>
-                <w:color w:val="111111"/>
-                <w:sz w:val="19"/>
-              </w:rPr>
-              <w:t>Web Developer</w:t>
-            </w:r>
-            <w:r>
-              <w:rPr>
-                <w:rFonts w:ascii="Calibri" w:hAnsi="Calibri"/>
-                <w:b/>
-                <w:color w:val="22C55E"/>
-                <w:sz w:val="16"/>
-              </w:rPr>
-              <w:t xml:space="preserve">   2022 – 2024</w:t>
-            </w:r>
-          </w:p>
-          <w:p>
-            <w:pPr>
-              <w:spacing w:before="0" w:after="0" w:line="240" w:lineRule="exact"/>
-            </w:pPr>
-            <w:r>
-              <w:rPr>
-                <w:rFonts w:ascii="Calibri" w:hAnsi="Calibri"/>
-                <w:b w:val="0"/>
-                <w:i/>
-                <w:color w:val="555555"/>
-                <w:sz w:val="17"/>
-              </w:rPr>
-              <w:t>ePandu Sdn Bhd</w:t>
-            </w:r>
-          </w:p>
-          <w:p>
-            <w:pPr>
-              <w:spacing w:before="0" w:after="0" w:line="240" w:lineRule="exact"/>
-            </w:pPr>
-            <w:r>
-              <w:rPr>
-                <w:rFonts w:ascii="Calibri" w:hAnsi="Calibri"/>
-                <w:color w:val="22C55E"/>
-                <w:sz w:val="16"/>
-              </w:rPr>
-              <w:t xml:space="preserve">  •  </w:t>
-            </w:r>
-            <w:r>
-              <w:rPr>
-                <w:rFonts w:ascii="Calibri" w:hAnsi="Calibri"/>
-                <w:color w:val="333333"/>
-                <w:sz w:val="16"/>
-              </w:rPr>
-              <w:t>Built job portal with merchant subscriptions generating recurring revenue</w:t>
-            </w:r>
-          </w:p>
-          <w:p>
-            <w:pPr>
-              <w:spacing w:before="0" w:after="0" w:line="240" w:lineRule="exact"/>
-            </w:pPr>
-            <w:r>
-              <w:rPr>
-                <w:rFonts w:ascii="Calibri" w:hAnsi="Calibri"/>
-                <w:color w:val="22C55E"/>
-                <w:sz w:val="16"/>
-              </w:rPr>
-              <w:t xml:space="preserve">  •  </w:t>
-            </w:r>
-            <w:r>
-              <w:rPr>
-                <w:rFonts w:ascii="Calibri" w:hAnsi="Calibri"/>
-                <w:color w:val="333333"/>
-                <w:sz w:val="16"/>
-              </w:rPr>
-              <w:t>Built full e-commerce platform — product management, payments, fulfillment</w:t>
-            </w:r>
-          </w:p>
-          <w:p>
-            <w:pPr>
-              <w:spacing w:before="80" w:after="0" w:line="20" w:lineRule="exact"/>
-            </w:pPr>
-            <w:r>
-              <w:rPr>
-                <w:rFonts w:ascii="Calibri" w:hAnsi="Calibri"/>
-                <w:b/>
-                <w:color w:val="111111"/>
-                <w:sz w:val="19"/>
-              </w:rPr>
-              <w:t>E-Commerce Developer</w:t>
-            </w:r>
-            <w:r>
-              <w:rPr>
-                <w:rFonts w:ascii="Calibri" w:hAnsi="Calibri"/>
-                <w:b/>
-                <w:color w:val="22C55E"/>
-                <w:sz w:val="16"/>
-              </w:rPr>
-              <w:t xml:space="preserve">   2021</w:t>
-            </w:r>
-          </w:p>
-          <w:p>
-            <w:pPr>
-              <w:spacing w:before="0" w:after="0" w:line="240" w:lineRule="exact"/>
-            </w:pPr>
-            <w:r>
-              <w:rPr>
-                <w:rFonts w:ascii="Calibri" w:hAnsi="Calibri"/>
-                <w:b w:val="0"/>
-                <w:i/>
-                <w:color w:val="555555"/>
-                <w:sz w:val="17"/>
-              </w:rPr>
-              <w:t>GAMA Supermarket &amp; Dept Store</w:t>
-            </w:r>
-          </w:p>
-          <w:p>
-            <w:pPr>
-              <w:spacing w:before="0" w:after="0" w:line="240" w:lineRule="exact"/>
-            </w:pPr>
-            <w:r>
-              <w:rPr>
-                <w:rFonts w:ascii="Calibri" w:hAnsi="Calibri"/>
-                <w:color w:val="22C55E"/>
-                <w:sz w:val="16"/>
-              </w:rPr>
-              <w:t xml:space="preserve">  •  </w:t>
-            </w:r>
-            <w:r>
-              <w:rPr>
-                <w:rFonts w:ascii="Calibri" w:hAnsi="Calibri"/>
-                <w:color w:val="333333"/>
-                <w:sz w:val="16"/>
-              </w:rPr>
-              <w:t>Built e-commerce platform from scratch for a major retail chain</w:t>
-            </w:r>
-          </w:p>
-          <w:p>
-            <w:pPr>
-              <w:spacing w:before="0" w:after="0" w:line="240" w:lineRule="exact"/>
-            </w:pPr>
-            <w:r>
-              <w:rPr>
-                <w:rFonts w:ascii="Calibri" w:hAnsi="Calibri"/>
-                <w:color w:val="22C55E"/>
-                <w:sz w:val="16"/>
-              </w:rPr>
-              <w:t xml:space="preserve">  •  </w:t>
-            </w:r>
-            <w:r>
-              <w:rPr>
-                <w:rFonts w:ascii="Calibri" w:hAnsi="Calibri"/>
-                <w:color w:val="333333"/>
-                <w:sz w:val="16"/>
-              </w:rPr>
-              <w:t>Managed department and cross-functional coordination</w:t>
-            </w:r>
-          </w:p>
-          <w:p>
-            <w:pPr>
-              <w:spacing w:before="80" w:after="0" w:line="20" w:lineRule="exact"/>
-            </w:pPr>
-            <w:r>
-              <w:rPr>
-                <w:rFonts w:ascii="Calibri" w:hAnsi="Calibri"/>
-                <w:b/>
-                <w:color w:val="111111"/>
-                <w:sz w:val="19"/>
-              </w:rPr>
-              <w:t>IT Support Specialist</w:t>
-            </w:r>
-            <w:r>
-              <w:rPr>
-                <w:rFonts w:ascii="Calibri" w:hAnsi="Calibri"/>
-                <w:b/>
-                <w:color w:val="22C55E"/>
-                <w:sz w:val="16"/>
-              </w:rPr>
-              <w:t xml:space="preserve">   2019 – 2020</w:t>
-            </w:r>
-          </w:p>
-          <w:p>
-            <w:pPr>
-              <w:spacing w:before="0" w:after="0" w:line="240" w:lineRule="exact"/>
-            </w:pPr>
-            <w:r>
-              <w:rPr>
-                <w:rFonts w:ascii="Calibri" w:hAnsi="Calibri"/>
-                <w:b w:val="0"/>
-                <w:i/>
-                <w:color w:val="555555"/>
-                <w:sz w:val="17"/>
-              </w:rPr>
-              <w:t>DISTED College</w:t>
-            </w:r>
-          </w:p>
-          <w:p>
-            <w:pPr>
-              <w:spacing w:before="0" w:after="0" w:line="240" w:lineRule="exact"/>
-            </w:pPr>
-            <w:r>
-              <w:rPr>
-                <w:rFonts w:ascii="Calibri" w:hAnsi="Calibri"/>
-                <w:color w:val="22C55E"/>
-                <w:sz w:val="16"/>
-              </w:rPr>
-              <w:t xml:space="preserve">  •  </w:t>
-            </w:r>
-            <w:r>
-              <w:rPr>
-                <w:rFonts w:ascii="Calibri" w:hAnsi="Calibri"/>
-                <w:color w:val="333333"/>
-                <w:sz w:val="16"/>
-              </w:rPr>
-              <w:t>Built library mgmt, ticketing, and knowledge base systems in-house</w:t>
-            </w:r>
-          </w:p>
-          <w:p>
-            <w:pPr>
-              <w:spacing w:before="0" w:after="0" w:line="240" w:lineRule="exact"/>
-            </w:pPr>
-            <w:r>
-              <w:rPr>
-                <w:rFonts w:ascii="Calibri" w:hAnsi="Calibri"/>
-                <w:color w:val="22C55E"/>
-                <w:sz w:val="16"/>
-              </w:rPr>
-              <w:t xml:space="preserve">  •  </w:t>
-            </w:r>
-            <w:r>
-              <w:rPr>
-                <w:rFonts w:ascii="Calibri" w:hAnsi="Calibri"/>
-                <w:color w:val="333333"/>
-                <w:sz w:val="16"/>
-              </w:rPr>
-              <w:t>Automated audit processes. Maintained ISO 9001</w:t>
-            </w:r>
-          </w:p>
-          <w:p>
-            <w:pPr>
-              <w:spacing w:before="80" w:after="0" w:line="20" w:lineRule="exact"/>
-            </w:pPr>
-            <w:r>
-              <w:rPr>
-                <w:rFonts w:ascii="Calibri" w:hAnsi="Calibri"/>
-                <w:b/>
-                <w:color w:val="111111"/>
-                <w:sz w:val="19"/>
-              </w:rPr>
-              <w:t>Asst. IT Supervisor</w:t>
-            </w:r>
-            <w:r>
-              <w:rPr>
-                <w:rFonts w:ascii="Calibri" w:hAnsi="Calibri"/>
-                <w:b/>
-                <w:color w:val="22C55E"/>
-                <w:sz w:val="16"/>
-              </w:rPr>
-              <w:t xml:space="preserve">   2016 – 2018</w:t>
-            </w:r>
-          </w:p>
-          <w:p>
-            <w:pPr>
-              <w:spacing w:before="0" w:after="0" w:line="240" w:lineRule="exact"/>
-            </w:pPr>
-            <w:r>
-              <w:rPr>
-                <w:rFonts w:ascii="Calibri" w:hAnsi="Calibri"/>
-                <w:b w:val="0"/>
-                <w:i/>
-                <w:color w:val="555555"/>
-                <w:sz w:val="17"/>
-              </w:rPr>
-              <w:t>GAMA Supermarket &amp; Dept Store</w:t>
-            </w:r>
-          </w:p>
-          <w:p>
-            <w:pPr>
-              <w:spacing w:before="0" w:after="0" w:line="240" w:lineRule="exact"/>
-            </w:pPr>
-            <w:r>
-              <w:rPr>
-                <w:rFonts w:ascii="Calibri" w:hAnsi="Calibri"/>
-                <w:color w:val="22C55E"/>
-                <w:sz w:val="16"/>
-              </w:rPr>
-              <w:t xml:space="preserve">  •  </w:t>
-            </w:r>
-            <w:r>
-              <w:rPr>
-                <w:rFonts w:ascii="Calibri" w:hAnsi="Calibri"/>
-                <w:color w:val="333333"/>
-                <w:sz w:val="16"/>
-              </w:rPr>
-              <w:t>Led company-wide POS deployment. Built ticketing and knowledge base systems</w:t>
-            </w:r>
-          </w:p>
-          <w:p>
-            <w:pPr>
-              <w:spacing w:before="80" w:after="0" w:line="20" w:lineRule="exact"/>
-            </w:pPr>
-            <w:r>
-              <w:rPr>
-                <w:rFonts w:ascii="Calibri" w:hAnsi="Calibri"/>
-                <w:b/>
-                <w:color w:val="111111"/>
-                <w:sz w:val="19"/>
-              </w:rPr>
-              <w:t>Software Engineer</w:t>
-            </w:r>
-            <w:r>
-              <w:rPr>
-                <w:rFonts w:ascii="Calibri" w:hAnsi="Calibri"/>
-                <w:b/>
-                <w:color w:val="22C55E"/>
-                <w:sz w:val="16"/>
-              </w:rPr>
-              <w:t xml:space="preserve">   2012 – 2015</w:t>
-            </w:r>
-          </w:p>
-          <w:p>
-            <w:pPr>
-              <w:spacing w:before="0" w:after="0" w:line="240" w:lineRule="exact"/>
-            </w:pPr>
-            <w:r>
-              <w:rPr>
-                <w:rFonts w:ascii="Calibri" w:hAnsi="Calibri"/>
-                <w:b w:val="0"/>
-                <w:i/>
-                <w:color w:val="555555"/>
-                <w:sz w:val="17"/>
-              </w:rPr>
-              <w:t>UniKL Resources Sdn Bhd</w:t>
-            </w:r>
-          </w:p>
-          <w:p>
-            <w:pPr>
-              <w:spacing w:before="0" w:after="0" w:line="240" w:lineRule="exact"/>
-            </w:pPr>
-            <w:r>
-              <w:rPr>
-                <w:rFonts w:ascii="Calibri" w:hAnsi="Calibri"/>
-                <w:color w:val="22C55E"/>
-                <w:sz w:val="16"/>
-              </w:rPr>
-              <w:t xml:space="preserve">  •  </w:t>
-            </w:r>
-            <w:r>
-              <w:rPr>
-                <w:rFonts w:ascii="Calibri" w:hAnsi="Calibri"/>
-                <w:color w:val="333333"/>
-                <w:sz w:val="16"/>
-              </w:rPr>
-              <w:t>Built financial system for MARA (government agency)</w:t>
-            </w:r>
-          </w:p>
-          <w:p>
-            <w:pPr>
-              <w:spacing w:before="0" w:after="0" w:line="240" w:lineRule="exact"/>
-            </w:pPr>
-            <w:r>
-              <w:rPr>
-                <w:rFonts w:ascii="Calibri" w:hAnsi="Calibri"/>
-                <w:color w:val="22C55E"/>
-                <w:sz w:val="16"/>
-              </w:rPr>
-              <w:t xml:space="preserve">  •  </w:t>
-            </w:r>
-            <w:r>
-              <w:rPr>
-                <w:rFonts w:ascii="Calibri" w:hAnsi="Calibri"/>
-                <w:color w:val="333333"/>
-                <w:sz w:val="16"/>
-              </w:rPr>
-              <w:t>Web services for e-Perolehan. Extended MS Dynamics AX</w:t>
-            </w:r>
-          </w:p>
-          <w:p>
-            <w:pPr>
-              <w:spacing w:before="160" w:after="60" w:line="20" w:lineRule="exact"/>
-              <w:pBdr>
-                <w:bottom w:val="single" w:sz="4" w:space="1" w:color="22C55E"/>
-              </w:pBdr>
-            </w:pPr>
-            <w:r>
-              <w:rPr>
-                <w:rFonts w:ascii="Calibri" w:hAnsi="Calibri"/>
-                <w:b/>
-                <w:color w:val="22C55E"/>
-                <w:sz w:val="18"/>
-              </w:rPr>
-              <w:t>FEATURED PROJECTS</w:t>
-            </w:r>
-          </w:p>
-          <w:p>
-            <w:pPr>
-              <w:spacing w:before="0" w:after="0" w:line="240" w:lineRule="exact"/>
-            </w:pPr>
-            <w:r>
-              <w:rPr>
-                <w:rFonts w:ascii="Calibri" w:hAnsi="Calibri"/>
-                <w:b/>
-                <w:i w:val="0"/>
-                <w:color w:val="111111"/>
-                <w:sz w:val="17"/>
-              </w:rPr>
-              <w:t>EOIOT — Enterprise ERP for Palm Oil</w:t>
-            </w:r>
-          </w:p>
-          <w:p>
-            <w:pPr>
-              <w:spacing w:before="0" w:after="0" w:line="240" w:lineRule="exact"/>
-            </w:pPr>
-            <w:r>
-              <w:rPr>
-                <w:rFonts w:ascii="Calibri" w:hAnsi="Calibri"/>
-                <w:b w:val="0"/>
-                <w:i w:val="0"/>
-                <w:color w:val="555555"/>
-                <w:sz w:val="16"/>
-              </w:rPr>
-              <w:t>Full-scale ERP replacing SAP/Navision. SCM, finance, HR, procurement, refinery ops.</w:t>
-            </w:r>
-          </w:p>
-          <w:p>
-            <w:pPr>
-              <w:spacing w:before="0" w:after="0" w:line="220" w:lineRule="exact"/>
-            </w:pPr>
-            <w:r>
-              <w:rPr>
-                <w:rFonts w:ascii="Calibri" w:hAnsi="Calibri"/>
-                <w:b w:val="0"/>
-                <w:i/>
-                <w:color w:val="999999"/>
-                <w:sz w:val="14"/>
-              </w:rPr>
-              <w:t>Stack: Nuxt · Vue · Python · Prisma · PostgreSQL</w:t>
-            </w:r>
-          </w:p>
-          <w:p>
-            <w:pPr>
-              <w:spacing w:before="0" w:after="0" w:line="240" w:lineRule="exact"/>
-            </w:pPr>
-            <w:r>
-              <w:rPr>
-                <w:rFonts w:ascii="Calibri" w:hAnsi="Calibri"/>
-                <w:b/>
-                <w:i w:val="0"/>
-                <w:color w:val="111111"/>
-                <w:sz w:val="17"/>
-              </w:rPr>
-              <w:t>TradeAI — AI Forex Trading System</w:t>
-            </w:r>
-          </w:p>
-          <w:p>
-            <w:pPr>
-              <w:spacing w:before="0" w:after="0" w:line="240" w:lineRule="exact"/>
-            </w:pPr>
-            <w:r>
-              <w:rPr>
-                <w:rFonts w:ascii="Calibri" w:hAnsi="Calibri"/>
-                <w:b w:val="0"/>
-                <w:i w:val="0"/>
-                <w:color w:val="555555"/>
-                <w:sz w:val="16"/>
-              </w:rPr>
-              <w:t>ML-powered forex prediction generating calibrated BUY/SELL probabilities from historical data.</w:t>
-            </w:r>
-          </w:p>
-          <w:p>
-            <w:pPr>
-              <w:spacing w:before="0" w:after="0" w:line="220" w:lineRule="exact"/>
-            </w:pPr>
-            <w:r>
-              <w:rPr>
-                <w:rFonts w:ascii="Calibri" w:hAnsi="Calibri"/>
-                <w:b w:val="0"/>
-                <w:i/>
-                <w:color w:val="999999"/>
-                <w:sz w:val="14"/>
-              </w:rPr>
-              <w:t>Stack: Python · FastAPI · Scikit-Learn · Pandas</w:t>
-            </w:r>
-          </w:p>
-          <w:p>
-            <w:pPr>
-              <w:spacing w:before="0" w:after="0" w:line="240" w:lineRule="exact"/>
-            </w:pPr>
-            <w:r>
-              <w:rPr>
-                <w:rFonts w:ascii="Calibri" w:hAnsi="Calibri"/>
-                <w:b/>
-                <w:i w:val="0"/>
-                <w:color w:val="111111"/>
-                <w:sz w:val="17"/>
-              </w:rPr>
-              <w:t>EMS — Engineering Management SaaS</w:t>
-            </w:r>
-          </w:p>
-          <w:p>
-            <w:pPr>
-              <w:spacing w:before="0" w:after="0" w:line="240" w:lineRule="exact"/>
-            </w:pPr>
-            <w:r>
-              <w:rPr>
-                <w:rFonts w:ascii="Calibri" w:hAnsi="Calibri"/>
-                <w:b w:val="0"/>
-                <w:i w:val="0"/>
-                <w:color w:val="555555"/>
-                <w:sz w:val="16"/>
-              </w:rPr>
-              <w:t>Platform for managing teams and projects with proper engineering standards.</w:t>
-            </w:r>
-          </w:p>
-          <w:p>
-            <w:pPr>
-              <w:spacing w:before="0" w:after="0" w:line="220" w:lineRule="exact"/>
-            </w:pPr>
-            <w:r>
-              <w:rPr>
-                <w:rFonts w:ascii="Calibri" w:hAnsi="Calibri"/>
-                <w:b w:val="0"/>
-                <w:i/>
-                <w:color w:val="999999"/>
-                <w:sz w:val="14"/>
-              </w:rPr>
-              <w:t>Stack: Nuxt · Vue · Vuetify · Prisma · TypeScript</w:t>
-            </w:r>
-          </w:p>
-          <w:p>
-            <w:pPr>
-              <w:spacing w:before="0" w:after="0" w:line="240" w:lineRule="exact"/>
-            </w:pPr>
-            <w:r>
-              <w:rPr>
-                <w:rFonts w:ascii="Calibri" w:hAnsi="Calibri"/>
-                <w:b/>
-                <w:i w:val="0"/>
-                <w:color w:val="111111"/>
-                <w:sz w:val="17"/>
-              </w:rPr>
-              <w:t>Second Brain — AI Knowledge System</w:t>
-            </w:r>
-          </w:p>
-          <w:p>
-            <w:pPr>
-              <w:spacing w:before="0" w:after="0" w:line="240" w:lineRule="exact"/>
-            </w:pPr>
-            <w:r>
-              <w:rPr>
-                <w:rFonts w:ascii="Calibri" w:hAnsi="Calibri"/>
-                <w:b w:val="0"/>
-                <w:i w:val="0"/>
-                <w:color w:val="555555"/>
-                <w:sz w:val="16"/>
-              </w:rPr>
-              <w:t>AI system processing 125,000+ documents with semantic search, knowledge graphs, and automated ingestion.</w:t>
-            </w:r>
-          </w:p>
-          <w:p>
-            <w:pPr>
-              <w:spacing w:before="0" w:after="0" w:line="220" w:lineRule="exact"/>
-            </w:pPr>
-            <w:r>
-              <w:rPr>
-                <w:rFonts w:ascii="Calibri" w:hAnsi="Calibri"/>
-                <w:b w:val="0"/>
-                <w:i/>
-                <w:color w:val="999999"/>
-                <w:sz w:val="14"/>
-              </w:rPr>
-              <w:t>Stack: Python · ChromaDB · LLM · FastAPI · SQLite</w:t>
-            </w:r>
-          </w:p>
-          <w:p>
-            <w:pPr>
-              <w:spacing w:before="160" w:after="60" w:line="20" w:lineRule="exact"/>
-              <w:pBdr>
-                <w:bottom w:val="single" w:sz="4" w:space="1" w:color="22C55E"/>
-              </w:pBdr>
-            </w:pPr>
-            <w:r>
-              <w:rPr>
-                <w:rFonts w:ascii="Calibri" w:hAnsi="Calibri"/>
-                <w:b/>
-                <w:color w:val="22C55E"/>
-                <w:sz w:val="18"/>
-              </w:rPr>
-              <w:t>WHY HIRE ME</w:t>
-            </w:r>
-          </w:p>
-          <w:p>
-            <w:pPr>
-              <w:spacing w:before="0" w:after="120" w:line="260" w:lineRule="exact"/>
-            </w:pPr>
-            <w:r>
-              <w:rPr>
-                <w:rFonts w:ascii="Calibri" w:hAnsi="Calibri"/>
-                <w:color w:val="166534"/>
-                <w:sz w:val="17"/>
-              </w:rPr>
-              <w:t xml:space="preserve">I replaced SAP with a custom ERP. I built 4 production systems from zero. 15 years of self-taught engineering across 6 industries. I lead teams, architect solutions, and ship code that works. </w:t>
-            </w:r>
-            <w:r>
-              <w:rPr>
-                <w:rFonts w:ascii="Calibri" w:hAnsi="Calibri"/>
-                <w:b/>
-                <w:color w:val="166534"/>
-                <w:sz w:val="17"/>
-              </w:rPr>
-              <w:t>Most engineers write code. I build businesses.</w:t>
-            </w:r>
-          </w:p>
-        </w:tc>
-      </w:tr>
-    </w:tbl>
+    <w:p>
+      <w:r>
+        <w:t>Mohamad Firdaus - Resume</w:t>
+      </w:r>
+    </w:p>
+    <w:p>
+      <w:r>
+        <w:t>@page { margin: 0; size: A4; }</w:t>
+      </w:r>
+    </w:p>
+    <w:p>
+      <w:r>
+        <w:t>* { margin: 0; padding: 0; box-sizing: border-box; }</w:t>
+      </w:r>
+    </w:p>
+    <w:p>
+      <w:r>
+        <w:t>body {</w:t>
+      </w:r>
+    </w:p>
+    <w:p>
+      <w:r>
+        <w:t>font-family: 'Inter', -apple-system, sans-serif;</w:t>
+      </w:r>
+    </w:p>
+    <w:p>
+      <w:r>
+        <w:t>font-size: 8pt;</w:t>
+      </w:r>
+    </w:p>
+    <w:p>
+      <w:r>
+        <w:t>line-height: 1.4;</w:t>
+      </w:r>
+    </w:p>
+    <w:p>
+      <w:r>
+        <w:t>color: #333;</w:t>
+      </w:r>
+    </w:p>
+    <w:p>
+      <w:r>
+        <w:t>background: #eee;</w:t>
+      </w:r>
+    </w:p>
+    <w:p>
+      <w:r>
+        <w:t>padding: 20px;</w:t>
+      </w:r>
+    </w:p>
+    <w:p>
+      <w:r>
+        <w:t>}</w:t>
+      </w:r>
+    </w:p>
+    <w:p>
+      <w:r>
+        <w:t>.page {</w:t>
+      </w:r>
+    </w:p>
+    <w:p>
+      <w:r>
+        <w:t>width: 210mm;</w:t>
+      </w:r>
+    </w:p>
+    <w:p>
+      <w:r>
+        <w:t>min-height: 297mm;</w:t>
+      </w:r>
+    </w:p>
+    <w:p>
+      <w:r>
+        <w:t>margin: 0 auto;</w:t>
+      </w:r>
+    </w:p>
+    <w:p>
+      <w:r>
+        <w:t>background: #fff;</w:t>
+      </w:r>
+    </w:p>
+    <w:p>
+      <w:r>
+        <w:t>display: grid;</w:t>
+      </w:r>
+    </w:p>
+    <w:p>
+      <w:r>
+        <w:t>grid-template-columns: 195px 1fr;</w:t>
+      </w:r>
+    </w:p>
+    <w:p>
+      <w:r>
+        <w:t>box-shadow: 0 2px 10px rgba(0,0,0,0.1);</w:t>
+      </w:r>
+    </w:p>
+    <w:p>
+      <w:r>
+        <w:t>overflow: hidden;</w:t>
+      </w:r>
+    </w:p>
+    <w:p>
+      <w:r>
+        <w:t>}</w:t>
+      </w:r>
+    </w:p>
+    <w:p>
+      <w:r>
+        <w:t>/* SIDEBAR */</w:t>
+      </w:r>
+    </w:p>
+    <w:p>
+      <w:r>
+        <w:t>.sidebar {</w:t>
+      </w:r>
+    </w:p>
+    <w:p>
+      <w:r>
+        <w:t>background: #1a1a2e;</w:t>
+      </w:r>
+    </w:p>
+    <w:p>
+      <w:r>
+        <w:t>color: #ccc;</w:t>
+      </w:r>
+    </w:p>
+    <w:p>
+      <w:r>
+        <w:t>padding: 28px 16px 24px;</w:t>
+      </w:r>
+    </w:p>
+    <w:p>
+      <w:r>
+        <w:t>display: flex;</w:t>
+      </w:r>
+    </w:p>
+    <w:p>
+      <w:r>
+        <w:t>flex-direction: column;</w:t>
+      </w:r>
+    </w:p>
+    <w:p>
+      <w:r>
+        <w:t>gap: 16px;</w:t>
+      </w:r>
+    </w:p>
+    <w:p>
+      <w:r>
+        <w:t>}</w:t>
+      </w:r>
+    </w:p>
+    <w:p>
+      <w:r>
+        <w:t>.sidebar h3 {</w:t>
+      </w:r>
+    </w:p>
+    <w:p>
+      <w:r>
+        <w:t>color: #22c55e;</w:t>
+      </w:r>
+    </w:p>
+    <w:p>
+      <w:r>
+        <w:t>font-size: 7pt;</w:t>
+      </w:r>
+    </w:p>
+    <w:p>
+      <w:r>
+        <w:t>font-weight: 700;</w:t>
+      </w:r>
+    </w:p>
+    <w:p>
+      <w:r>
+        <w:t>letter-spacing: 1.2px;</w:t>
+      </w:r>
+    </w:p>
+    <w:p>
+      <w:r>
+        <w:t>text-transform: uppercase;</w:t>
+      </w:r>
+    </w:p>
+    <w:p>
+      <w:r>
+        <w:t>border-bottom: 1.5px solid #22c55e;</w:t>
+      </w:r>
+    </w:p>
+    <w:p>
+      <w:r>
+        <w:t>padding-bottom: 3px;</w:t>
+      </w:r>
+    </w:p>
+    <w:p>
+      <w:r>
+        <w:t>margin-bottom: 5px;</w:t>
+      </w:r>
+    </w:p>
+    <w:p>
+      <w:r>
+        <w:t>}</w:t>
+      </w:r>
+    </w:p>
+    <w:p>
+      <w:r>
+        <w:t>.sidebar .contact-row {</w:t>
+      </w:r>
+    </w:p>
+    <w:p>
+      <w:r>
+        <w:t>display: flex;</w:t>
+      </w:r>
+    </w:p>
+    <w:p>
+      <w:r>
+        <w:t>align-items: center;</w:t>
+      </w:r>
+    </w:p>
+    <w:p>
+      <w:r>
+        <w:t>gap: 5px;</w:t>
+      </w:r>
+    </w:p>
+    <w:p>
+      <w:r>
+        <w:t>font-size: 7pt;</w:t>
+      </w:r>
+    </w:p>
+    <w:p>
+      <w:r>
+        <w:t>color: #bbb;</w:t>
+      </w:r>
+    </w:p>
+    <w:p>
+      <w:r>
+        <w:t>margin-bottom: 2px;</w:t>
+      </w:r>
+    </w:p>
+    <w:p>
+      <w:r>
+        <w:t>}</w:t>
+      </w:r>
+    </w:p>
+    <w:p>
+      <w:r>
+        <w:t>.sidebar .contact-row a.sidebar-link {</w:t>
+      </w:r>
+    </w:p>
+    <w:p>
+      <w:r>
+        <w:t>color: #bbb;</w:t>
+      </w:r>
+    </w:p>
     <w:sectPr>
       <w:pgSz w:w="12240" w:h="15840"/>
-      <w:pgMar w:top="0" w:right="0" w:bottom="0" w:left="0" w:header="720" w:footer="720" w:gutter="0"/>
+      <w:pgMar w:top="1440" w:right="1800" w:bottom="1440" w:left="1800" w:header="720" w:footer="720" w:gutter="0"/>
       <w:cols w:space="720"/>
       <w:docGrid w:linePitch="360"/>
     </w:sectPr>
@@ -1771,6 +625,10 @@
     <w:name w:val="Normal"/>
     <w:qFormat/>
     <w:rsid w:val="00FC693F"/>
+    <w:rPr>
+      <w:rFonts w:ascii="Calibri" w:hAnsi="Calibri"/>
+      <w:sz w:val="20"/>
+    </w:rPr>
   </w:style>
   <w:style w:type="paragraph" w:styleId="Header">
     <w:name w:val="header"/>

</xml_diff>

<commit_message>
feat(web-profile): add private local AI project
</commit_message>
<xml_diff>
--- a/Mohamad_Firdaus_Resume_2026.docx
+++ b/Mohamad_Firdaus_Resume_2026.docx
@@ -252,7 +252,7 @@
           <w:sz w:val="18"/>
           <w:szCs w:val="18"/>
         </w:rPr>
-        <w:t xml:space="preserve">    2024 – Present</w:t>
+        <w:t xml:space="preserve">    2024 – Aug 2026</w:t>
       </w:r>
     </w:p>
     <w:p>
@@ -730,6 +730,19 @@
       </w:pPr>
       <w:r>
         <w:t xml:space="preserve">Second Brain — AI Knowledge: AI system with 125K+ docs, semantic search, knowledge graphs. Python · ChromaDB · LLM · FastAPI · SQLite</w:t>
+      </w:r>
+    </w:p>
+    <w:p>
+      <w:pPr>
+        <w:pStyle w:val="ListParagraph"/>
+        <w:numPr>
+          <w:ilvl w:val="0"/>
+          <w:numId w:val="2"/>
+        </w:numPr>
+        <w:spacing w:after="40"/>
+      </w:pPr>
+      <w:r>
+        <w:t xml:space="preserve">Private Local AI Assistant — private/local AI build with model routing, document retrieval, typed safety boundaries and redacted review. Python · Local AI · Retrieval</w:t>
       </w:r>
     </w:p>
     <w:p>

</xml_diff>